<commit_message>
Script doet het maar ga m nog even opschonen, even pushen zodat ik makkelijk de wijzigingen kan terugdraaien
</commit_message>
<xml_diff>
--- a/assignment_week_5_group3/Assignment_week5.docx
+++ b/assignment_week_5_group3/Assignment_week5.docx
@@ -32,7 +32,35 @@
         <w:rPr>
           <w:lang w:val="en-US"/>
         </w:rPr>
-        <w:t xml:space="preserve">The dataset used is the Reuters-21578 Distribution 1.0, which mainly consists of business news articles. It contains 12,902 documents, which have been pre-split into training and test sets using the </w:t>
+        <w:t xml:space="preserve">The </w:t>
+      </w:r>
+      <w:proofErr w:type="gramStart"/>
+      <w:r>
+        <w:rPr>
+          <w:lang w:val="en-US"/>
+        </w:rPr>
+        <w:t>dataset</w:t>
+      </w:r>
+      <w:proofErr w:type="gramEnd"/>
+      <w:r>
+        <w:rPr>
+          <w:lang w:val="en-US"/>
+        </w:rPr>
+        <w:t xml:space="preserve"> used is </w:t>
+      </w:r>
+      <w:proofErr w:type="gramStart"/>
+      <w:r>
+        <w:rPr>
+          <w:lang w:val="en-US"/>
+        </w:rPr>
+        <w:t>the Reuters</w:t>
+      </w:r>
+      <w:proofErr w:type="gramEnd"/>
+      <w:r>
+        <w:rPr>
+          <w:lang w:val="en-US"/>
+        </w:rPr>
+        <w:t xml:space="preserve">-21578 Distribution 1.0, which mainly consists of business news articles. It contains 12,902 documents, which have been pre-split into training and test sets using the </w:t>
       </w:r>
       <w:proofErr w:type="spellStart"/>
       <w:r>
@@ -46,7 +74,21 @@
         <w:rPr>
           <w:lang w:val="en-US"/>
         </w:rPr>
-        <w:t xml:space="preserve"> split. The training set comprises approximately 74.4% of the data, while the test set comprises about 25.6%. In total, there are 118 classes, which differs slightly from the 136 classes reported in the original study. The most frequent classes are 'earn', '</w:t>
+        <w:t xml:space="preserve"> split. The training set comprises approximately 74.4% of the data, while the test set comprises about 25.6%. In total, there are 118 classes, which differs slightly from the 136 classes reported in the original study. The most frequent classes are '</w:t>
+      </w:r>
+      <w:proofErr w:type="gramStart"/>
+      <w:r>
+        <w:rPr>
+          <w:lang w:val="en-US"/>
+        </w:rPr>
+        <w:t>earn</w:t>
+      </w:r>
+      <w:proofErr w:type="gramEnd"/>
+      <w:r>
+        <w:rPr>
+          <w:lang w:val="en-US"/>
+        </w:rPr>
+        <w:t>', '</w:t>
       </w:r>
       <w:proofErr w:type="spellStart"/>
       <w:r>
@@ -292,7 +334,21 @@
         <w:rPr>
           <w:lang w:val="en-US"/>
         </w:rPr>
-        <w:t xml:space="preserve"> from scikit-learn to align with the methodology described in the original paper. By providing a predefined vocabulary derived from both the training and test sets, we ensured a consistent feature matrix across both datasets. The training data was processed using </w:t>
+        <w:t xml:space="preserve"> from scikit-learn to align with the methodology described in the original paper. By providing </w:t>
+      </w:r>
+      <w:proofErr w:type="gramStart"/>
+      <w:r>
+        <w:rPr>
+          <w:lang w:val="en-US"/>
+        </w:rPr>
+        <w:t>a predefined</w:t>
+      </w:r>
+      <w:proofErr w:type="gramEnd"/>
+      <w:r>
+        <w:rPr>
+          <w:lang w:val="en-US"/>
+        </w:rPr>
+        <w:t xml:space="preserve"> vocabulary derived from both the training and test sets, we ensured a consistent feature matrix across both datasets. The training data was processed using </w:t>
       </w:r>
       <w:proofErr w:type="spellStart"/>
       <w:r>
@@ -744,8 +800,19 @@
       </w:r>
       <w:proofErr w:type="spellEnd"/>
       <w:r>
-        <w:t xml:space="preserve"> tekst</w:t>
-      </w:r>
+        <w:t xml:space="preserve"> </w:t>
+      </w:r>
+      <w:proofErr w:type="spellStart"/>
+      <w:r>
+        <w:t>te</w:t>
+      </w:r>
+      <w:r>
+        <w:t>x</w:t>
+      </w:r>
+      <w:r>
+        <w:t>t</w:t>
+      </w:r>
+      <w:proofErr w:type="spellEnd"/>
     </w:p>
     <w:p>
       <w:pPr>
@@ -769,15 +836,7 @@
       </w:r>
       <w:proofErr w:type="spellEnd"/>
       <w:r>
-        <w:t xml:space="preserve"> </w:t>
-      </w:r>
-      <w:proofErr w:type="spellStart"/>
-      <w:r>
-        <w:t>the</w:t>
-      </w:r>
-      <w:proofErr w:type="spellEnd"/>
-      <w:r>
-        <w:t xml:space="preserve"> internet</w:t>
+        <w:t xml:space="preserve"> the internet</w:t>
       </w:r>
     </w:p>
     <w:p>
@@ -813,14 +872,42 @@
         <w:rPr>
           <w:lang w:val="en-US"/>
         </w:rPr>
-        <w:t xml:space="preserve">now how to work further. For example, I didn’t understand what the paper meant with ‘building a binary classifier for </w:t>
+        <w:t xml:space="preserve">now how to work further. For example, I didn’t understand what the paper meant </w:t>
+      </w:r>
+      <w:proofErr w:type="gramStart"/>
+      <w:r>
+        <w:rPr>
+          <w:lang w:val="en-US"/>
+        </w:rPr>
+        <w:t>with ‘</w:t>
+      </w:r>
+      <w:proofErr w:type="gramEnd"/>
+      <w:r>
+        <w:rPr>
+          <w:lang w:val="en-US"/>
+        </w:rPr>
+        <w:t xml:space="preserve">building a binary classifier for </w:t>
       </w:r>
       <w:r>
         <w:rPr>
           <w:lang w:val="en-US"/>
         </w:rPr>
         <w:lastRenderedPageBreak/>
-        <w:t xml:space="preserve">each of the 10 most populous classes’. AI was used to implement this in our own code. </w:t>
+        <w:t xml:space="preserve">each of the 10 most populous </w:t>
+      </w:r>
+      <w:proofErr w:type="gramStart"/>
+      <w:r>
+        <w:rPr>
+          <w:lang w:val="en-US"/>
+        </w:rPr>
+        <w:t>classes’</w:t>
+      </w:r>
+      <w:proofErr w:type="gramEnd"/>
+      <w:r>
+        <w:rPr>
+          <w:lang w:val="en-US"/>
+        </w:rPr>
+        <w:t xml:space="preserve">. AI was used to implement this in our own code. </w:t>
       </w:r>
     </w:p>
     <w:p>
@@ -840,11 +927,19 @@
         </w:rPr>
         <w:t xml:space="preserve">Fixing errors. For example, I didn’t understand how to fix empty tokens. AI was used to </w:t>
       </w:r>
-      <w:r>
-        <w:rPr>
-          <w:lang w:val="en-US"/>
-        </w:rPr>
-        <w:t xml:space="preserve">understand how to remove these. </w:t>
+      <w:proofErr w:type="gramStart"/>
+      <w:r>
+        <w:rPr>
+          <w:lang w:val="en-US"/>
+        </w:rPr>
+        <w:t>understand</w:t>
+      </w:r>
+      <w:proofErr w:type="gramEnd"/>
+      <w:r>
+        <w:rPr>
+          <w:lang w:val="en-US"/>
+        </w:rPr>
+        <w:t xml:space="preserve"> how to remove these. </w:t>
       </w:r>
     </w:p>
     <w:sectPr>
@@ -1878,6 +1973,7 @@
   <w:style w:type="character" w:default="1" w:styleId="Standaardalinea-lettertype">
     <w:name w:val="Default Paragraph Font"/>
     <w:uiPriority w:val="1"/>
+    <w:semiHidden/>
     <w:unhideWhenUsed/>
   </w:style>
   <w:style w:type="table" w:default="1" w:styleId="Standaardtabel">

</xml_diff>

<commit_message>
Oké klaar voor vandaag
</commit_message>
<xml_diff>
--- a/assignment_week_5_group3/Assignment_week5.docx
+++ b/assignment_week_5_group3/Assignment_week5.docx
@@ -10,12 +10,14 @@
           <w:numId w:val="2"/>
         </w:numPr>
         <w:rPr>
+          <w:rFonts w:asciiTheme="minorHAnsi" w:hAnsiTheme="minorHAnsi"/>
           <w:sz w:val="24"/>
           <w:szCs w:val="24"/>
         </w:rPr>
       </w:pPr>
       <w:r>
         <w:rPr>
+          <w:rFonts w:asciiTheme="minorHAnsi" w:hAnsiTheme="minorHAnsi"/>
           <w:sz w:val="24"/>
           <w:szCs w:val="24"/>
         </w:rPr>
@@ -32,91 +34,7 @@
         <w:rPr>
           <w:lang w:val="en-US"/>
         </w:rPr>
-        <w:t xml:space="preserve">The </w:t>
-      </w:r>
-      <w:proofErr w:type="gramStart"/>
-      <w:r>
-        <w:rPr>
-          <w:lang w:val="en-US"/>
-        </w:rPr>
-        <w:t>dataset</w:t>
-      </w:r>
-      <w:proofErr w:type="gramEnd"/>
-      <w:r>
-        <w:rPr>
-          <w:lang w:val="en-US"/>
-        </w:rPr>
-        <w:t xml:space="preserve"> used is </w:t>
-      </w:r>
-      <w:proofErr w:type="gramStart"/>
-      <w:r>
-        <w:rPr>
-          <w:lang w:val="en-US"/>
-        </w:rPr>
-        <w:t>the Reuters</w:t>
-      </w:r>
-      <w:proofErr w:type="gramEnd"/>
-      <w:r>
-        <w:rPr>
-          <w:lang w:val="en-US"/>
-        </w:rPr>
-        <w:t xml:space="preserve">-21578 Distribution 1.0, which mainly consists of business news articles. It contains 12,902 documents, which have been pre-split into training and test sets using the </w:t>
-      </w:r>
-      <w:proofErr w:type="spellStart"/>
-      <w:r>
-        <w:rPr>
-          <w:lang w:val="en-US"/>
-        </w:rPr>
-        <w:t>ModApte</w:t>
-      </w:r>
-      <w:proofErr w:type="spellEnd"/>
-      <w:r>
-        <w:rPr>
-          <w:lang w:val="en-US"/>
-        </w:rPr>
-        <w:t xml:space="preserve"> split. The training set comprises approximately 74.4% of the data, while the test set comprises about 25.6%. In total, there are 118 classes, which differs slightly from the 136 classes reported in the original study. The most frequent classes are '</w:t>
-      </w:r>
-      <w:proofErr w:type="gramStart"/>
-      <w:r>
-        <w:rPr>
-          <w:lang w:val="en-US"/>
-        </w:rPr>
-        <w:t>earn</w:t>
-      </w:r>
-      <w:proofErr w:type="gramEnd"/>
-      <w:r>
-        <w:rPr>
-          <w:lang w:val="en-US"/>
-        </w:rPr>
-        <w:t>', '</w:t>
-      </w:r>
-      <w:proofErr w:type="spellStart"/>
-      <w:r>
-        <w:rPr>
-          <w:lang w:val="en-US"/>
-        </w:rPr>
-        <w:t>acq</w:t>
-      </w:r>
-      <w:proofErr w:type="spellEnd"/>
-      <w:r>
-        <w:rPr>
-          <w:lang w:val="en-US"/>
-        </w:rPr>
-        <w:t>', and 'money-</w:t>
-      </w:r>
-      <w:proofErr w:type="spellStart"/>
-      <w:r>
-        <w:rPr>
-          <w:lang w:val="en-US"/>
-        </w:rPr>
-        <w:t>fx</w:t>
-      </w:r>
-      <w:proofErr w:type="spellEnd"/>
-      <w:r>
-        <w:rPr>
-          <w:lang w:val="en-US"/>
-        </w:rPr>
-        <w:t>'.</w:t>
+        <w:t>The dataset used is the Reuters-21578 Distribution 1.0, which mainly consists of business news articles. It contains 12,902 documents, which have been pre-split into training and test sets using the ModApte split. The training set comprises approximately 74.4% of the data, while the test set comprises about 25.6%. In total, there are 118 classes, which differs slightly from the 136 classes reported in the original study. The most frequent classes are 'earn', 'acq', and 'money-fx'.</w:t>
       </w:r>
     </w:p>
     <w:p>
@@ -152,12 +70,14 @@
           <w:numId w:val="2"/>
         </w:numPr>
         <w:rPr>
+          <w:rFonts w:asciiTheme="minorHAnsi" w:hAnsiTheme="minorHAnsi"/>
           <w:sz w:val="24"/>
           <w:szCs w:val="24"/>
         </w:rPr>
       </w:pPr>
       <w:r>
         <w:rPr>
+          <w:rFonts w:asciiTheme="minorHAnsi" w:hAnsiTheme="minorHAnsi"/>
           <w:sz w:val="24"/>
           <w:szCs w:val="24"/>
         </w:rPr>
@@ -176,7 +96,6 @@
         </w:rPr>
         <w:t xml:space="preserve">For pre-processing, several steps were undertaken to convert the raw documents into tokens. First, all empty or non-string entries were removed, and punctuation was eliminated. The text was then converted to lowercase and tokenized using NLTK’s </w:t>
       </w:r>
-      <w:proofErr w:type="spellStart"/>
       <w:r>
         <w:rPr>
           <w:i/>
@@ -185,32 +104,11 @@
         </w:rPr>
         <w:t>word_tokenize</w:t>
       </w:r>
-      <w:proofErr w:type="spellEnd"/>
-      <w:r>
-        <w:rPr>
-          <w:lang w:val="en-US"/>
-        </w:rPr>
-        <w:t xml:space="preserve"> function. </w:t>
-      </w:r>
-      <w:r>
-        <w:rPr>
-          <w:lang w:val="en-US"/>
-        </w:rPr>
-        <w:t xml:space="preserve">Next, </w:t>
-      </w:r>
-      <w:proofErr w:type="spellStart"/>
-      <w:r>
-        <w:rPr>
-          <w:lang w:val="en-US"/>
-        </w:rPr>
-        <w:t>stopwords</w:t>
-      </w:r>
-      <w:proofErr w:type="spellEnd"/>
-      <w:r>
-        <w:rPr>
-          <w:lang w:val="en-US"/>
-        </w:rPr>
-        <w:t xml:space="preserve"> were removed</w:t>
+      <w:r>
+        <w:rPr>
+          <w:lang w:val="en-US"/>
+        </w:rPr>
+        <w:t xml:space="preserve"> function. Next, stopwords were removed</w:t>
       </w:r>
       <w:r>
         <w:rPr>
@@ -222,21 +120,7 @@
         <w:rPr>
           <w:lang w:val="en-US"/>
         </w:rPr>
-        <w:t xml:space="preserve">hese were taken from the NLTK </w:t>
-      </w:r>
-      <w:proofErr w:type="spellStart"/>
-      <w:r>
-        <w:rPr>
-          <w:lang w:val="en-US"/>
-        </w:rPr>
-        <w:t>stopwords</w:t>
-      </w:r>
-      <w:proofErr w:type="spellEnd"/>
-      <w:r>
-        <w:rPr>
-          <w:lang w:val="en-US"/>
-        </w:rPr>
-        <w:t xml:space="preserve"> package. Tokens consisting entirely of digits were also removed, as well as very short tokens (length less than </w:t>
+        <w:t xml:space="preserve">hese were taken from the NLTK stopwords package. Tokens consisting entirely of digits were also removed, as well as very short tokens (length less than </w:t>
       </w:r>
       <w:r>
         <w:rPr>
@@ -261,21 +145,7 @@
         <w:rPr>
           <w:lang w:val="en-US"/>
         </w:rPr>
-        <w:t xml:space="preserve">The training and test sets were processed separately with this function, resulting in a list of tokens per document. These tokens were then used to build a vocabulary. Words that appeared only once across the training set were filtered out, as they carry minimal information for classification. After these steps, the resulting vocabulary consisted of 17,594 words, which is smaller than the vocabulary size reported in the original study (19,371 words). The difference arises because the original study only removed </w:t>
-      </w:r>
-      <w:proofErr w:type="spellStart"/>
-      <w:r>
-        <w:rPr>
-          <w:lang w:val="en-US"/>
-        </w:rPr>
-        <w:t>stopwords</w:t>
-      </w:r>
-      <w:proofErr w:type="spellEnd"/>
-      <w:r>
-        <w:rPr>
-          <w:lang w:val="en-US"/>
-        </w:rPr>
-        <w:t>, whereas here we additionally removed punctuation, very short tokens, and rare words.</w:t>
+        <w:t>The training and test sets were processed separately with this function, resulting in a list of tokens per document. These tokens were then used to build a vocabulary. Words that appeared only once across the training set were filtered out, as they carry minimal information for classification. After these steps, the resulting vocabulary consisted of 17,594 words, which is smaller than the vocabulary size reported in the original study (19,371 words). The difference arises because the original study only removed stopwords, whereas here we additionally removed punctuation, very short tokens, and rare words.</w:t>
       </w:r>
     </w:p>
     <w:p>
@@ -286,12 +156,14 @@
           <w:numId w:val="2"/>
         </w:numPr>
         <w:rPr>
+          <w:rFonts w:asciiTheme="minorHAnsi" w:hAnsiTheme="minorHAnsi"/>
           <w:sz w:val="24"/>
           <w:szCs w:val="24"/>
         </w:rPr>
       </w:pPr>
       <w:r>
         <w:rPr>
+          <w:rFonts w:asciiTheme="minorHAnsi" w:hAnsiTheme="minorHAnsi"/>
           <w:sz w:val="24"/>
           <w:szCs w:val="24"/>
         </w:rPr>
@@ -308,61 +180,7 @@
         <w:rPr>
           <w:lang w:val="en-US"/>
         </w:rPr>
-        <w:t xml:space="preserve">The pre-processed text was converted into numerical representations using vectorization. </w:t>
-      </w:r>
-      <w:r>
-        <w:rPr>
-          <w:lang w:val="en-US"/>
-        </w:rPr>
-        <w:t>W</w:t>
-      </w:r>
-      <w:r>
-        <w:rPr>
-          <w:lang w:val="en-US"/>
-        </w:rPr>
-        <w:t xml:space="preserve">e implemented the </w:t>
-      </w:r>
-      <w:proofErr w:type="spellStart"/>
-      <w:r>
-        <w:rPr>
-          <w:lang w:val="en-US"/>
-        </w:rPr>
-        <w:t>CountVectorizer</w:t>
-      </w:r>
-      <w:proofErr w:type="spellEnd"/>
-      <w:r>
-        <w:rPr>
-          <w:lang w:val="en-US"/>
-        </w:rPr>
-        <w:t xml:space="preserve"> from scikit-learn to align with the methodology described in the original paper. By providing </w:t>
-      </w:r>
-      <w:proofErr w:type="gramStart"/>
-      <w:r>
-        <w:rPr>
-          <w:lang w:val="en-US"/>
-        </w:rPr>
-        <w:t>a predefined</w:t>
-      </w:r>
-      <w:proofErr w:type="gramEnd"/>
-      <w:r>
-        <w:rPr>
-          <w:lang w:val="en-US"/>
-        </w:rPr>
-        <w:t xml:space="preserve"> vocabulary derived from both the training and test sets, we ensured a consistent feature matrix across both datasets. The training data was processed using </w:t>
-      </w:r>
-      <w:proofErr w:type="spellStart"/>
-      <w:r>
-        <w:rPr>
-          <w:lang w:val="en-US"/>
-        </w:rPr>
-        <w:t>fit_transform</w:t>
-      </w:r>
-      <w:proofErr w:type="spellEnd"/>
-      <w:r>
-        <w:rPr>
-          <w:lang w:val="en-US"/>
-        </w:rPr>
-        <w:t xml:space="preserve">, while the test </w:t>
+        <w:t xml:space="preserve">The pre-processed text was converted into numerical representations using vectorization. We implemented the CountVectorizer from scikit-learn to align with the methodology described in the original paper. By providing a predefined vocabulary derived from both the training and test sets, we ensured a consistent feature matrix across both datasets. The training data was processed using fit_transform, while the test </w:t>
       </w:r>
       <w:r>
         <w:rPr>
@@ -380,31 +198,24 @@
           <w:numId w:val="2"/>
         </w:numPr>
         <w:rPr>
+          <w:rFonts w:asciiTheme="minorHAnsi" w:hAnsiTheme="minorHAnsi"/>
           <w:sz w:val="24"/>
           <w:szCs w:val="24"/>
         </w:rPr>
       </w:pPr>
       <w:r>
         <w:rPr>
+          <w:rFonts w:asciiTheme="minorHAnsi" w:hAnsiTheme="minorHAnsi"/>
           <w:sz w:val="24"/>
           <w:szCs w:val="24"/>
         </w:rPr>
-        <w:t xml:space="preserve">Model </w:t>
-      </w:r>
-      <w:proofErr w:type="spellStart"/>
-      <w:r>
-        <w:rPr>
-          <w:sz w:val="24"/>
-          <w:szCs w:val="24"/>
-        </w:rPr>
-        <w:t>specification</w:t>
-      </w:r>
-      <w:proofErr w:type="spellEnd"/>
-    </w:p>
-    <w:p>
-      <w:pPr>
-        <w:rPr>
-          <w:lang w:val="en-US"/>
+        <w:t>Model specification</w:t>
+      </w:r>
+    </w:p>
+    <w:p>
+      <w:pPr>
+        <w:rPr>
+          <w:lang w:val="en-GB"/>
         </w:rPr>
       </w:pPr>
       <w:r>
@@ -412,6 +223,244 @@
           <w:lang w:val="en-GB"/>
         </w:rPr>
         <w:t>Description of the model, name model assumptions, model hyperparameters available, smoothing methods available.</w:t>
+      </w:r>
+    </w:p>
+    <w:p>
+      <w:pPr>
+        <w:rPr>
+          <w:lang w:val="en-US"/>
+        </w:rPr>
+      </w:pPr>
+      <w:r>
+        <w:rPr>
+          <w:lang w:val="en-US"/>
+        </w:rPr>
+        <w:t xml:space="preserve">Naïve Bayes </w:t>
+      </w:r>
+      <w:r>
+        <w:rPr>
+          <w:lang w:val="en-US"/>
+        </w:rPr>
+        <w:t>is a</w:t>
+      </w:r>
+      <w:r>
+        <w:rPr>
+          <w:lang w:val="en-US"/>
+        </w:rPr>
+        <w:t xml:space="preserve"> probabilistic classifier based on Bayes’ theorem</w:t>
+      </w:r>
+      <w:r>
+        <w:rPr>
+          <w:lang w:val="en-US"/>
+        </w:rPr>
+        <w:t>. This classifier a</w:t>
+      </w:r>
+      <w:r>
+        <w:rPr>
+          <w:lang w:val="en-US"/>
+        </w:rPr>
+        <w:t xml:space="preserve">ssumes </w:t>
+      </w:r>
+      <w:r>
+        <w:rPr>
+          <w:lang w:val="en-US"/>
+        </w:rPr>
+        <w:t>conditional independence between features</w:t>
+      </w:r>
+      <w:r>
+        <w:rPr>
+          <w:lang w:val="en-US"/>
+        </w:rPr>
+        <w:t xml:space="preserve"> </w:t>
+      </w:r>
+      <w:r>
+        <w:rPr>
+          <w:lang w:val="en-US"/>
+        </w:rPr>
+        <w:t>(strong assumption)</w:t>
+      </w:r>
+      <w:r>
+        <w:rPr>
+          <w:lang w:val="en-US"/>
+        </w:rPr>
+        <w:t xml:space="preserve"> and w</w:t>
+      </w:r>
+      <w:r>
+        <w:rPr>
+          <w:lang w:val="en-US"/>
+        </w:rPr>
+        <w:t>orks surprisingly well for text classification</w:t>
+      </w:r>
+      <w:r>
+        <w:rPr>
+          <w:lang w:val="en-US"/>
+        </w:rPr>
+        <w:t>.</w:t>
+      </w:r>
+    </w:p>
+    <w:p>
+      <w:pPr>
+        <w:rPr>
+          <w:lang w:val="en-US"/>
+        </w:rPr>
+      </w:pPr>
+      <w:r>
+        <w:rPr>
+          <w:rFonts w:cs="Segoe UI Emoji"/>
+          <w:lang w:val="en-US"/>
+        </w:rPr>
+        <w:t>Difference</w:t>
+      </w:r>
+      <w:r>
+        <w:rPr>
+          <w:lang w:val="en-US"/>
+        </w:rPr>
+        <w:t>:</w:t>
+      </w:r>
+      <w:r>
+        <w:rPr>
+          <w:lang w:val="en-US"/>
+        </w:rPr>
+        <w:t xml:space="preserve"> </w:t>
+      </w:r>
+      <w:r>
+        <w:rPr>
+          <w:lang w:val="en-US"/>
+        </w:rPr>
+        <w:t>Multinomial NB</w:t>
+      </w:r>
+      <w:r>
+        <w:rPr>
+          <w:lang w:val="en-US"/>
+        </w:rPr>
+        <w:t xml:space="preserve"> </w:t>
+      </w:r>
+      <w:r>
+        <w:rPr>
+          <w:lang w:val="en-US"/>
+        </w:rPr>
+        <w:t>uses word frequencies (counts)</w:t>
+      </w:r>
+      <w:r>
+        <w:rPr>
+          <w:lang w:val="en-US"/>
+        </w:rPr>
+        <w:t xml:space="preserve"> and </w:t>
+      </w:r>
+      <w:r>
+        <w:rPr>
+          <w:lang w:val="en-US"/>
+        </w:rPr>
+        <w:t>captures how often words occur</w:t>
+      </w:r>
+      <w:r>
+        <w:rPr>
+          <w:lang w:val="en-US"/>
+        </w:rPr>
+        <w:t xml:space="preserve">. </w:t>
+      </w:r>
+      <w:r>
+        <w:rPr>
+          <w:lang w:val="en-US"/>
+        </w:rPr>
+        <w:t>Be</w:t>
+      </w:r>
+      <w:r>
+        <w:rPr>
+          <w:lang w:val="en-US"/>
+        </w:rPr>
+        <w:t>r</w:t>
+      </w:r>
+      <w:r>
+        <w:rPr>
+          <w:lang w:val="en-US"/>
+        </w:rPr>
+        <w:t>noulli NB</w:t>
+      </w:r>
+      <w:r>
+        <w:rPr>
+          <w:lang w:val="en-US"/>
+        </w:rPr>
+        <w:t xml:space="preserve"> </w:t>
+      </w:r>
+      <w:r>
+        <w:rPr>
+          <w:lang w:val="en-US"/>
+        </w:rPr>
+        <w:t>uses binary features (word present or not)</w:t>
+      </w:r>
+      <w:r>
+        <w:rPr>
+          <w:lang w:val="en-US"/>
+        </w:rPr>
+        <w:t xml:space="preserve"> and </w:t>
+      </w:r>
+      <w:r>
+        <w:rPr>
+          <w:lang w:val="en-US"/>
+        </w:rPr>
+        <w:t>ignores frequency information</w:t>
+      </w:r>
+      <w:r>
+        <w:rPr>
+          <w:lang w:val="en-US"/>
+        </w:rPr>
+        <w:t>.</w:t>
+      </w:r>
+    </w:p>
+    <w:p>
+      <w:pPr>
+        <w:rPr>
+          <w:lang w:val="en-US"/>
+        </w:rPr>
+      </w:pPr>
+      <w:r>
+        <w:rPr>
+          <w:lang w:val="en-US"/>
+        </w:rPr>
+        <w:t>Hyperparameter:</w:t>
+      </w:r>
+      <w:r>
+        <w:rPr>
+          <w:lang w:val="en-US"/>
+        </w:rPr>
+        <w:t xml:space="preserve"> </w:t>
+      </w:r>
+      <w:r>
+        <w:rPr>
+          <w:lang w:val="en-US"/>
+        </w:rPr>
+        <w:t>Laplace smoothing used</w:t>
+      </w:r>
+      <w:r>
+        <w:rPr>
+          <w:lang w:val="en-US"/>
+        </w:rPr>
+        <w:t xml:space="preserve"> </w:t>
+      </w:r>
+      <w:r>
+        <w:rPr>
+          <w:lang w:val="en-US"/>
+        </w:rPr>
+        <w:t>alpha = 1.0</w:t>
+      </w:r>
+      <w:r>
+        <w:rPr>
+          <w:lang w:val="en-US"/>
+        </w:rPr>
+        <w:t xml:space="preserve">, </w:t>
+      </w:r>
+      <w:r>
+        <w:rPr>
+          <w:lang w:val="en-US"/>
+        </w:rPr>
+        <w:t xml:space="preserve">prevents zero </w:t>
+      </w:r>
+      <w:r>
+        <w:rPr>
+          <w:lang w:val="en-US"/>
+        </w:rPr>
+        <w:t>probabilities</w:t>
       </w:r>
     </w:p>
     <w:p>
@@ -422,31 +471,24 @@
           <w:numId w:val="2"/>
         </w:numPr>
         <w:rPr>
+          <w:rFonts w:asciiTheme="minorHAnsi" w:hAnsiTheme="minorHAnsi"/>
           <w:sz w:val="24"/>
           <w:szCs w:val="24"/>
         </w:rPr>
       </w:pPr>
       <w:r>
         <w:rPr>
+          <w:rFonts w:asciiTheme="minorHAnsi" w:hAnsiTheme="minorHAnsi"/>
           <w:sz w:val="24"/>
           <w:szCs w:val="24"/>
         </w:rPr>
-        <w:t xml:space="preserve">Training </w:t>
-      </w:r>
-      <w:proofErr w:type="spellStart"/>
-      <w:r>
-        <w:rPr>
-          <w:sz w:val="24"/>
-          <w:szCs w:val="24"/>
-        </w:rPr>
-        <w:t>phase</w:t>
-      </w:r>
-      <w:proofErr w:type="spellEnd"/>
-    </w:p>
-    <w:p>
-      <w:pPr>
-        <w:rPr>
-          <w:lang w:val="en-US"/>
+        <w:t>Training phase</w:t>
+      </w:r>
+    </w:p>
+    <w:p>
+      <w:pPr>
+        <w:rPr>
+          <w:lang w:val="en-GB"/>
         </w:rPr>
       </w:pPr>
       <w:r>
@@ -454,6 +496,85 @@
           <w:lang w:val="en-GB"/>
         </w:rPr>
         <w:t>Specify model hyperparameters, applied smoothing method</w:t>
+      </w:r>
+    </w:p>
+    <w:p>
+      <w:pPr>
+        <w:rPr>
+          <w:lang w:val="en-GB"/>
+        </w:rPr>
+      </w:pPr>
+      <w:r>
+        <w:rPr>
+          <w:lang w:val="en-GB"/>
+        </w:rPr>
+        <w:t>A separate binary classifier was trained for each topic.</w:t>
+      </w:r>
+      <w:r>
+        <w:rPr>
+          <w:lang w:val="en-GB"/>
+        </w:rPr>
+        <w:t xml:space="preserve"> </w:t>
+      </w:r>
+      <w:r>
+        <w:rPr>
+          <w:lang w:val="en-GB"/>
+        </w:rPr>
+        <w:t>(top 10 topics)</w:t>
+      </w:r>
+      <w:r>
+        <w:rPr>
+          <w:lang w:val="en-GB"/>
+        </w:rPr>
+        <w:t xml:space="preserve">. </w:t>
+      </w:r>
+      <w:r>
+        <w:rPr>
+          <w:lang w:val="en-GB"/>
+        </w:rPr>
+        <w:t>One-vs-rest setup</w:t>
+      </w:r>
+      <w:r>
+        <w:rPr>
+          <w:lang w:val="en-GB"/>
+        </w:rPr>
+        <w:t xml:space="preserve">. </w:t>
+      </w:r>
+      <w:r>
+        <w:rPr>
+          <w:lang w:val="en-GB"/>
+        </w:rPr>
+        <w:t>Models trained on training split only</w:t>
+      </w:r>
+      <w:r>
+        <w:rPr>
+          <w:lang w:val="en-GB"/>
+        </w:rPr>
+        <w:t xml:space="preserve">. </w:t>
+      </w:r>
+      <w:r>
+        <w:rPr>
+          <w:lang w:val="en-GB"/>
+        </w:rPr>
+        <w:t>No cross-validation used</w:t>
+      </w:r>
+      <w:r>
+        <w:rPr>
+          <w:lang w:val="en-GB"/>
+        </w:rPr>
+        <w:t xml:space="preserve">. </w:t>
+      </w:r>
+      <w:r>
+        <w:rPr>
+          <w:lang w:val="en-GB"/>
+        </w:rPr>
+        <w:t>Both models were trained using identical settings to ensure a fair comparison.</w:t>
+      </w:r>
+      <w:r>
+        <w:rPr>
+          <w:lang w:val="en-GB"/>
+        </w:rPr>
+        <w:t xml:space="preserve"> </w:t>
       </w:r>
     </w:p>
     <w:p>
@@ -464,12 +585,14 @@
           <w:numId w:val="2"/>
         </w:numPr>
         <w:rPr>
+          <w:rFonts w:asciiTheme="minorHAnsi" w:hAnsiTheme="minorHAnsi"/>
           <w:sz w:val="24"/>
           <w:szCs w:val="24"/>
         </w:rPr>
       </w:pPr>
       <w:r>
         <w:rPr>
+          <w:rFonts w:asciiTheme="minorHAnsi" w:hAnsiTheme="minorHAnsi"/>
           <w:sz w:val="24"/>
           <w:szCs w:val="24"/>
         </w:rPr>
@@ -478,20 +601,102 @@
     </w:p>
     <w:p>
       <w:pPr>
-        <w:spacing w:after="0" w:line="240" w:lineRule="auto"/>
-        <w:rPr>
-          <w:sz w:val="22"/>
-          <w:szCs w:val="22"/>
-          <w:lang w:val="en-GB"/>
-        </w:rPr>
-      </w:pPr>
-      <w:r>
-        <w:rPr>
-          <w:sz w:val="22"/>
-          <w:szCs w:val="22"/>
+        <w:rPr>
+          <w:lang w:val="en-GB"/>
+        </w:rPr>
+      </w:pPr>
+      <w:r>
+        <w:rPr>
           <w:lang w:val="en-GB"/>
         </w:rPr>
         <w:t>Description of train/test split or cross-validation used, performance metrics, number of runs (for cross-validation or averages), experimental conditions like vocabulary size.</w:t>
+      </w:r>
+    </w:p>
+    <w:p>
+      <w:pPr>
+        <w:rPr>
+          <w:lang w:val="en-GB"/>
+        </w:rPr>
+      </w:pPr>
+      <w:r>
+        <w:rPr>
+          <w:lang w:val="en-GB"/>
+        </w:rPr>
+        <w:t>ModApte split (predefined train/test split)</w:t>
+      </w:r>
+      <w:r>
+        <w:rPr>
+          <w:lang w:val="en-GB"/>
+        </w:rPr>
+        <w:t xml:space="preserve">. </w:t>
+      </w:r>
+      <w:r>
+        <w:rPr>
+          <w:lang w:val="en-GB"/>
+        </w:rPr>
+        <w:t>No random split</w:t>
+      </w:r>
+      <w:r>
+        <w:rPr>
+          <w:lang w:val="en-GB"/>
+        </w:rPr>
+        <w:t>.</w:t>
+      </w:r>
+    </w:p>
+    <w:p>
+      <w:pPr>
+        <w:rPr>
+          <w:lang w:val="en-GB"/>
+        </w:rPr>
+      </w:pPr>
+      <w:r>
+        <w:rPr>
+          <w:lang w:val="en-GB"/>
+        </w:rPr>
+        <w:t>The models were evaluated using precision, recall, and F1-score.</w:t>
+      </w:r>
+      <w:r>
+        <w:rPr>
+          <w:lang w:val="en-GB"/>
+        </w:rPr>
+        <w:t xml:space="preserve"> </w:t>
+      </w:r>
+      <w:r>
+        <w:rPr>
+          <w:lang w:val="en-GB"/>
+        </w:rPr>
+        <w:t>F1-score being used as the main one because it h</w:t>
+      </w:r>
+      <w:r>
+        <w:rPr>
+          <w:lang w:val="en-GB"/>
+        </w:rPr>
+        <w:t>andles imbalance</w:t>
+      </w:r>
+      <w:r>
+        <w:rPr>
+          <w:lang w:val="en-GB"/>
+        </w:rPr>
+        <w:t>, c</w:t>
+      </w:r>
+      <w:r>
+        <w:rPr>
+          <w:lang w:val="en-GB"/>
+        </w:rPr>
+        <w:t>ombines precision + recall</w:t>
+      </w:r>
+    </w:p>
+    <w:p>
+      <w:pPr>
+        <w:rPr>
+          <w:lang w:val="en-GB"/>
+        </w:rPr>
+      </w:pPr>
+      <w:r>
+        <w:rPr>
+          <w:lang w:val="en-GB"/>
+        </w:rPr>
+        <w:t>Results averaged over 10 topics</w:t>
       </w:r>
     </w:p>
     <w:p>
@@ -502,24 +707,24 @@
           <w:numId w:val="2"/>
         </w:numPr>
         <w:rPr>
+          <w:rFonts w:asciiTheme="minorHAnsi" w:hAnsiTheme="minorHAnsi"/>
           <w:sz w:val="24"/>
           <w:szCs w:val="24"/>
         </w:rPr>
       </w:pPr>
-      <w:proofErr w:type="spellStart"/>
-      <w:r>
-        <w:rPr>
+      <w:r>
+        <w:rPr>
+          <w:rFonts w:asciiTheme="minorHAnsi" w:hAnsiTheme="minorHAnsi"/>
           <w:sz w:val="24"/>
           <w:szCs w:val="24"/>
         </w:rPr>
         <w:t>Results</w:t>
       </w:r>
-      <w:proofErr w:type="spellEnd"/>
-    </w:p>
-    <w:p>
-      <w:pPr>
-        <w:rPr>
-          <w:lang w:val="en-US"/>
+    </w:p>
+    <w:p>
+      <w:pPr>
+        <w:rPr>
+          <w:lang w:val="en-GB"/>
         </w:rPr>
       </w:pPr>
       <w:r>
@@ -527,6 +732,281 @@
           <w:lang w:val="en-GB"/>
         </w:rPr>
         <w:t>Present the output of the evaluation, graph performance metrics, compare results for different models</w:t>
+      </w:r>
+    </w:p>
+    <w:p>
+      <w:pPr>
+        <w:rPr>
+          <w:lang w:val="en-GB"/>
+        </w:rPr>
+      </w:pPr>
+      <w:r>
+        <w:rPr>
+          <w:lang w:val="en-GB"/>
+        </w:rPr>
+        <w:t>The performance of both models is shown below.</w:t>
+      </w:r>
+    </w:p>
+    <w:p>
+      <w:pPr>
+        <w:rPr>
+          <w:lang w:val="en-GB"/>
+        </w:rPr>
+      </w:pPr>
+      <w:r>
+        <w:rPr>
+          <w:noProof/>
+        </w:rPr>
+        <w:lastRenderedPageBreak/>
+        <w:drawing>
+          <wp:anchor distT="0" distB="0" distL="114300" distR="114300" simplePos="0" relativeHeight="251659264" behindDoc="0" locked="0" layoutInCell="1" allowOverlap="1" wp14:anchorId="28005524" wp14:editId="1258FF05">
+            <wp:simplePos x="0" y="0"/>
+            <wp:positionH relativeFrom="column">
+              <wp:posOffset>65405</wp:posOffset>
+            </wp:positionH>
+            <wp:positionV relativeFrom="paragraph">
+              <wp:posOffset>3215005</wp:posOffset>
+            </wp:positionV>
+            <wp:extent cx="3733800" cy="2800350"/>
+            <wp:effectExtent l="0" t="0" r="0" b="0"/>
+            <wp:wrapTopAndBottom/>
+            <wp:docPr id="1526875787" name="Afbeelding 2"/>
+            <wp:cNvGraphicFramePr>
+              <a:graphicFrameLocks xmlns:a="http://schemas.openxmlformats.org/drawingml/2006/main" noChangeAspect="1"/>
+            </wp:cNvGraphicFramePr>
+            <a:graphic xmlns:a="http://schemas.openxmlformats.org/drawingml/2006/main">
+              <a:graphicData uri="http://schemas.openxmlformats.org/drawingml/2006/picture">
+                <pic:pic xmlns:pic="http://schemas.openxmlformats.org/drawingml/2006/picture">
+                  <pic:nvPicPr>
+                    <pic:cNvPr id="1526875787" name="Afbeelding 1526875787"/>
+                    <pic:cNvPicPr/>
+                  </pic:nvPicPr>
+                  <pic:blipFill>
+                    <a:blip r:embed="rId5">
+                      <a:extLst>
+                        <a:ext uri="{28A0092B-C50C-407E-A947-70E740481C1C}">
+                          <a14:useLocalDpi xmlns:a14="http://schemas.microsoft.com/office/drawing/2010/main" val="0"/>
+                        </a:ext>
+                      </a:extLst>
+                    </a:blip>
+                    <a:stretch>
+                      <a:fillRect/>
+                    </a:stretch>
+                  </pic:blipFill>
+                  <pic:spPr>
+                    <a:xfrm>
+                      <a:off x="0" y="0"/>
+                      <a:ext cx="3733800" cy="2800350"/>
+                    </a:xfrm>
+                    <a:prstGeom prst="rect">
+                      <a:avLst/>
+                    </a:prstGeom>
+                  </pic:spPr>
+                </pic:pic>
+              </a:graphicData>
+            </a:graphic>
+            <wp14:sizeRelH relativeFrom="margin">
+              <wp14:pctWidth>0</wp14:pctWidth>
+            </wp14:sizeRelH>
+            <wp14:sizeRelV relativeFrom="margin">
+              <wp14:pctHeight>0</wp14:pctHeight>
+            </wp14:sizeRelV>
+          </wp:anchor>
+        </w:drawing>
+      </w:r>
+      <w:r>
+        <w:rPr>
+          <w:noProof/>
+        </w:rPr>
+        <w:drawing>
+          <wp:anchor distT="0" distB="0" distL="114300" distR="114300" simplePos="0" relativeHeight="251658240" behindDoc="0" locked="0" layoutInCell="1" allowOverlap="1" wp14:anchorId="00300E19" wp14:editId="0D72F501">
+            <wp:simplePos x="0" y="0"/>
+            <wp:positionH relativeFrom="column">
+              <wp:posOffset>-2540</wp:posOffset>
+            </wp:positionH>
+            <wp:positionV relativeFrom="paragraph">
+              <wp:posOffset>0</wp:posOffset>
+            </wp:positionV>
+            <wp:extent cx="3634740" cy="2726055"/>
+            <wp:effectExtent l="0" t="0" r="3810" b="0"/>
+            <wp:wrapTopAndBottom/>
+            <wp:docPr id="948495813" name="Afbeelding 1"/>
+            <wp:cNvGraphicFramePr>
+              <a:graphicFrameLocks xmlns:a="http://schemas.openxmlformats.org/drawingml/2006/main" noChangeAspect="1"/>
+            </wp:cNvGraphicFramePr>
+            <a:graphic xmlns:a="http://schemas.openxmlformats.org/drawingml/2006/main">
+              <a:graphicData uri="http://schemas.openxmlformats.org/drawingml/2006/picture">
+                <pic:pic xmlns:pic="http://schemas.openxmlformats.org/drawingml/2006/picture">
+                  <pic:nvPicPr>
+                    <pic:cNvPr id="948495813" name="Afbeelding 948495813"/>
+                    <pic:cNvPicPr/>
+                  </pic:nvPicPr>
+                  <pic:blipFill>
+                    <a:blip r:embed="rId6">
+                      <a:extLst>
+                        <a:ext uri="{28A0092B-C50C-407E-A947-70E740481C1C}">
+                          <a14:useLocalDpi xmlns:a14="http://schemas.microsoft.com/office/drawing/2010/main" val="0"/>
+                        </a:ext>
+                      </a:extLst>
+                    </a:blip>
+                    <a:stretch>
+                      <a:fillRect/>
+                    </a:stretch>
+                  </pic:blipFill>
+                  <pic:spPr>
+                    <a:xfrm>
+                      <a:off x="0" y="0"/>
+                      <a:ext cx="3634740" cy="2726055"/>
+                    </a:xfrm>
+                    <a:prstGeom prst="rect">
+                      <a:avLst/>
+                    </a:prstGeom>
+                  </pic:spPr>
+                </pic:pic>
+              </a:graphicData>
+            </a:graphic>
+            <wp14:sizeRelH relativeFrom="margin">
+              <wp14:pctWidth>0</wp14:pctWidth>
+            </wp14:sizeRelH>
+            <wp14:sizeRelV relativeFrom="margin">
+              <wp14:pctHeight>0</wp14:pctHeight>
+            </wp14:sizeRelV>
+          </wp:anchor>
+        </w:drawing>
+      </w:r>
+      <w:r>
+        <w:rPr>
+          <w:lang w:val="en-GB"/>
+        </w:rPr>
+        <w:t>Figure 1 shows the average F1-score per model.</w:t>
+      </w:r>
+      <w:r>
+        <w:rPr>
+          <w:lang w:val="en-GB"/>
+        </w:rPr>
+        <w:t xml:space="preserve"> </w:t>
+      </w:r>
+      <w:r>
+        <w:rPr>
+          <w:lang w:val="en-GB"/>
+        </w:rPr>
+        <w:t>The Multinomial model significantly outperforms the Bernoulli model.</w:t>
+      </w:r>
+      <w:r>
+        <w:rPr>
+          <w:lang w:val="en-GB"/>
+        </w:rPr>
+        <w:t xml:space="preserve"> </w:t>
+      </w:r>
+      <w:r>
+        <w:rPr>
+          <w:lang w:val="en-GB"/>
+        </w:rPr>
+        <w:t>(~0.73 vs ~0.38)</w:t>
+      </w:r>
+    </w:p>
+    <w:p>
+      <w:pPr>
+        <w:rPr>
+          <w:lang w:val="en-GB"/>
+        </w:rPr>
+      </w:pPr>
+      <w:r>
+        <w:rPr>
+          <w:lang w:val="en-GB"/>
+        </w:rPr>
+        <w:t>Figure 2 shows the F1-score per topic.</w:t>
+      </w:r>
+      <w:r>
+        <w:rPr>
+          <w:lang w:val="en-GB"/>
+        </w:rPr>
+        <w:t xml:space="preserve"> </w:t>
+      </w:r>
+      <w:r>
+        <w:rPr>
+          <w:lang w:val="en-GB"/>
+        </w:rPr>
+        <w:t xml:space="preserve">The Multinomial model performs better for nearly all topics. </w:t>
+      </w:r>
+      <w:r>
+        <w:rPr>
+          <w:lang w:val="en-GB"/>
+        </w:rPr>
+        <w:t>Big differences on</w:t>
+      </w:r>
+      <w:r>
+        <w:rPr>
+          <w:lang w:val="en-GB"/>
+        </w:rPr>
+        <w:t xml:space="preserve"> </w:t>
+      </w:r>
+      <w:r>
+        <w:rPr>
+          <w:lang w:val="en-GB"/>
+        </w:rPr>
+        <w:t>crude</w:t>
+      </w:r>
+      <w:r>
+        <w:rPr>
+          <w:lang w:val="en-GB"/>
+        </w:rPr>
+        <w:t xml:space="preserve">, </w:t>
+      </w:r>
+      <w:r>
+        <w:rPr>
+          <w:lang w:val="en-GB"/>
+        </w:rPr>
+        <w:t>ship</w:t>
+      </w:r>
+      <w:r>
+        <w:rPr>
+          <w:lang w:val="en-GB"/>
+        </w:rPr>
+        <w:t xml:space="preserve"> and </w:t>
+      </w:r>
+      <w:r>
+        <w:rPr>
+          <w:lang w:val="en-GB"/>
+        </w:rPr>
+        <w:t>wheat</w:t>
+      </w:r>
+      <w:r>
+        <w:rPr>
+          <w:lang w:val="en-GB"/>
+        </w:rPr>
+        <w:t xml:space="preserve">. </w:t>
+      </w:r>
+      <w:r>
+        <w:rPr>
+          <w:lang w:val="en-GB"/>
+        </w:rPr>
+        <w:t>One exception:</w:t>
+      </w:r>
+      <w:r>
+        <w:rPr>
+          <w:lang w:val="en-GB"/>
+        </w:rPr>
+        <w:t xml:space="preserve"> </w:t>
+      </w:r>
+      <w:r>
+        <w:rPr>
+          <w:lang w:val="en-GB"/>
+        </w:rPr>
+        <w:t>acq (similar performance)</w:t>
+      </w:r>
+    </w:p>
+    <w:p>
+      <w:pPr>
+        <w:rPr>
+          <w:lang w:val="en-GB"/>
+        </w:rPr>
+      </w:pPr>
+      <w:r>
+        <w:rPr>
+          <w:lang w:val="en-GB"/>
+        </w:rPr>
+        <w:t>Overall, the Multinomial model consistently achieves higher performance.</w:t>
       </w:r>
     </w:p>
     <w:p>
@@ -537,19 +1017,207 @@
           <w:numId w:val="2"/>
         </w:numPr>
         <w:rPr>
+          <w:rFonts w:asciiTheme="minorHAnsi" w:hAnsiTheme="minorHAnsi"/>
           <w:sz w:val="24"/>
           <w:szCs w:val="24"/>
         </w:rPr>
       </w:pPr>
-      <w:proofErr w:type="spellStart"/>
-      <w:r>
-        <w:rPr>
+      <w:r>
+        <w:rPr>
+          <w:rFonts w:asciiTheme="minorHAnsi" w:hAnsiTheme="minorHAnsi"/>
           <w:sz w:val="24"/>
           <w:szCs w:val="24"/>
         </w:rPr>
         <w:t>Discussion</w:t>
       </w:r>
-      <w:proofErr w:type="spellEnd"/>
+    </w:p>
+    <w:p>
+      <w:pPr>
+        <w:rPr>
+          <w:lang w:val="en-GB"/>
+        </w:rPr>
+      </w:pPr>
+      <w:r>
+        <w:rPr>
+          <w:lang w:val="en-GB"/>
+        </w:rPr>
+        <w:t>Which model performed better, can you explain why this is the case, and, most importantly in this case, do your results match the findings presented in the paper?</w:t>
+      </w:r>
+    </w:p>
+    <w:p>
+      <w:pPr>
+        <w:rPr>
+          <w:lang w:val="en-GB"/>
+        </w:rPr>
+      </w:pPr>
+      <w:r>
+        <w:rPr>
+          <w:rFonts w:ascii="Segoe UI Emoji" w:hAnsi="Segoe UI Emoji" w:cs="Segoe UI Emoji"/>
+          <w:lang w:val="en-GB"/>
+        </w:rPr>
+        <w:t>👉</w:t>
+      </w:r>
+      <w:r>
+        <w:rPr>
+          <w:lang w:val="en-GB"/>
+        </w:rPr>
+        <w:t xml:space="preserve"> Hier ga je verklaren</w:t>
+      </w:r>
+    </w:p>
+    <w:p>
+      <w:pPr>
+        <w:rPr>
+          <w:lang w:val="en-GB"/>
+        </w:rPr>
+      </w:pPr>
+    </w:p>
+    <w:p>
+      <w:pPr>
+        <w:rPr>
+          <w:lang w:val="en-GB"/>
+        </w:rPr>
+      </w:pPr>
+      <w:r>
+        <w:rPr>
+          <w:lang w:val="en-GB"/>
+        </w:rPr>
+        <w:t>Welke is beter?</w:t>
+      </w:r>
+    </w:p>
+    <w:p>
+      <w:pPr>
+        <w:rPr>
+          <w:lang w:val="en-GB"/>
+        </w:rPr>
+      </w:pPr>
+    </w:p>
+    <w:p>
+      <w:pPr>
+        <w:rPr>
+          <w:lang w:val="en-GB"/>
+        </w:rPr>
+      </w:pPr>
+      <w:r>
+        <w:rPr>
+          <w:lang w:val="en-GB"/>
+        </w:rPr>
+        <w:t>Multinomial NB performs better</w:t>
+      </w:r>
+      <w:r>
+        <w:rPr>
+          <w:lang w:val="en-GB"/>
+        </w:rPr>
+        <w:t xml:space="preserve"> because it u</w:t>
+      </w:r>
+      <w:r>
+        <w:rPr>
+          <w:lang w:val="en-GB"/>
+        </w:rPr>
+        <w:t>ses word frequency</w:t>
+      </w:r>
+      <w:r>
+        <w:rPr>
+          <w:lang w:val="en-GB"/>
+        </w:rPr>
+        <w:t>, gives</w:t>
+      </w:r>
+      <w:r>
+        <w:rPr>
+          <w:lang w:val="en-GB"/>
+        </w:rPr>
+        <w:t xml:space="preserve"> more information</w:t>
+      </w:r>
+      <w:r>
+        <w:rPr>
+          <w:lang w:val="en-GB"/>
+        </w:rPr>
+        <w:t xml:space="preserve">. </w:t>
+      </w:r>
+      <w:r>
+        <w:rPr>
+          <w:lang w:val="en-GB"/>
+        </w:rPr>
+        <w:t>Bernoulli loses info (only 0/1)</w:t>
+      </w:r>
+      <w:r>
+        <w:rPr>
+          <w:lang w:val="en-GB"/>
+        </w:rPr>
+        <w:t xml:space="preserve">. </w:t>
+      </w:r>
+      <w:r>
+        <w:rPr>
+          <w:lang w:val="en-GB"/>
+        </w:rPr>
+        <w:t>Frequent words matter in text classification</w:t>
+      </w:r>
+      <w:r>
+        <w:rPr>
+          <w:lang w:val="en-GB"/>
+        </w:rPr>
+        <w:t>.</w:t>
+      </w:r>
+      <w:r>
+        <w:rPr>
+          <w:lang w:val="en-GB"/>
+        </w:rPr>
+        <w:t xml:space="preserve"> </w:t>
+      </w:r>
+      <w:r>
+        <w:rPr>
+          <w:lang w:val="en-GB"/>
+        </w:rPr>
+        <w:t>The Multinomial model benefits from using word frequencies.</w:t>
+      </w:r>
+      <w:r>
+        <w:rPr>
+          <w:lang w:val="en-GB"/>
+        </w:rPr>
+        <w:t xml:space="preserve"> </w:t>
+      </w:r>
+      <w:r>
+        <w:rPr>
+          <w:lang w:val="en-GB"/>
+        </w:rPr>
+        <w:t>The Bernoulli model loses information by binarizing features.</w:t>
+      </w:r>
+    </w:p>
+    <w:p>
+      <w:pPr>
+        <w:rPr>
+          <w:lang w:val="en-GB"/>
+        </w:rPr>
+      </w:pPr>
+      <w:r>
+        <w:rPr>
+          <w:lang w:val="en-GB"/>
+        </w:rPr>
+        <w:t>These findings are consistent with the original paper.</w:t>
+      </w:r>
+      <w:r>
+        <w:rPr>
+          <w:lang w:val="en-GB"/>
+        </w:rPr>
+        <w:t xml:space="preserve"> </w:t>
+      </w:r>
+      <w:r>
+        <w:rPr>
+          <w:lang w:val="en-GB"/>
+        </w:rPr>
+        <w:t>The Multinomial model is reported to outperform the Bernoulli model in most cases.</w:t>
+      </w:r>
+      <w:r>
+        <w:rPr>
+          <w:lang w:val="en-GB"/>
+        </w:rPr>
+        <w:t xml:space="preserve"> However, f</w:t>
+      </w:r>
+      <w:r>
+        <w:rPr>
+          <w:lang w:val="en-GB"/>
+        </w:rPr>
+        <w:t>or some topics, the difference is smaller, indicating that word presence alone can sometimes be sufficient.</w:t>
+      </w:r>
     </w:p>
     <w:p>
       <w:pPr>
@@ -560,14 +1228,6 @@
           <w:lang w:val="en-GB"/>
         </w:rPr>
       </w:pPr>
-      <w:r>
-        <w:rPr>
-          <w:sz w:val="22"/>
-          <w:szCs w:val="22"/>
-          <w:lang w:val="en-GB"/>
-        </w:rPr>
-        <w:t>Which model performed better, can you explain why this is the case, and, most importantly in this case, do your results match the findings presented in the paper?</w:t>
-      </w:r>
     </w:p>
     <w:p>
       <w:pPr>
@@ -577,24 +1237,24 @@
           <w:numId w:val="2"/>
         </w:numPr>
         <w:rPr>
+          <w:rFonts w:asciiTheme="minorHAnsi" w:hAnsiTheme="minorHAnsi"/>
           <w:sz w:val="24"/>
           <w:szCs w:val="24"/>
         </w:rPr>
       </w:pPr>
-      <w:proofErr w:type="spellStart"/>
-      <w:r>
-        <w:rPr>
+      <w:r>
+        <w:rPr>
+          <w:rFonts w:asciiTheme="minorHAnsi" w:hAnsiTheme="minorHAnsi"/>
           <w:sz w:val="24"/>
           <w:szCs w:val="24"/>
         </w:rPr>
         <w:t>Reflection</w:t>
       </w:r>
-      <w:proofErr w:type="spellEnd"/>
-    </w:p>
-    <w:p>
-      <w:pPr>
-        <w:rPr>
-          <w:lang w:val="en-US"/>
+    </w:p>
+    <w:p>
+      <w:pPr>
+        <w:rPr>
+          <w:lang w:val="en-GB"/>
         </w:rPr>
       </w:pPr>
       <w:r>
@@ -602,6 +1262,146 @@
           <w:lang w:val="en-GB"/>
         </w:rPr>
         <w:t>Looking back at your replicating the experiment, what went well and did you run into any problems along the way? Is the information provided in the paper clear enough to replicate the experiment?</w:t>
+      </w:r>
+    </w:p>
+    <w:p>
+      <w:pPr>
+        <w:rPr>
+          <w:lang w:val="en-GB"/>
+        </w:rPr>
+      </w:pPr>
+      <w:r>
+        <w:rPr>
+          <w:lang w:val="en-GB"/>
+        </w:rPr>
+        <w:t>Models implemented correctly</w:t>
+      </w:r>
+      <w:r>
+        <w:rPr>
+          <w:lang w:val="en-GB"/>
+        </w:rPr>
+        <w:t>, r</w:t>
+      </w:r>
+      <w:r>
+        <w:rPr>
+          <w:lang w:val="en-GB"/>
+        </w:rPr>
+        <w:t>esults make sense</w:t>
+      </w:r>
+      <w:r>
+        <w:rPr>
+          <w:lang w:val="en-GB"/>
+        </w:rPr>
+        <w:t>, r</w:t>
+      </w:r>
+      <w:r>
+        <w:rPr>
+          <w:lang w:val="en-GB"/>
+        </w:rPr>
+        <w:t>eproducible pipeline</w:t>
+      </w:r>
+      <w:r>
+        <w:rPr>
+          <w:lang w:val="en-GB"/>
+        </w:rPr>
+        <w:t>.</w:t>
+      </w:r>
+    </w:p>
+    <w:p>
+      <w:pPr>
+        <w:rPr>
+          <w:lang w:val="en-GB"/>
+        </w:rPr>
+      </w:pPr>
+      <w:r>
+        <w:rPr>
+          <w:lang w:val="en-GB"/>
+        </w:rPr>
+        <w:t>Problem</w:t>
+      </w:r>
+      <w:r>
+        <w:rPr>
+          <w:lang w:val="en-GB"/>
+        </w:rPr>
+        <w:t>s</w:t>
+      </w:r>
+      <w:r>
+        <w:rPr>
+          <w:lang w:val="en-GB"/>
+        </w:rPr>
+        <w:t>:</w:t>
+      </w:r>
+      <w:r>
+        <w:rPr>
+          <w:lang w:val="en-GB"/>
+        </w:rPr>
+        <w:t xml:space="preserve"> </w:t>
+      </w:r>
+      <w:r>
+        <w:rPr>
+          <w:lang w:val="en-GB"/>
+        </w:rPr>
+        <w:t>Multi-label needed binary classifiers</w:t>
+      </w:r>
+      <w:r>
+        <w:rPr>
+          <w:lang w:val="en-GB"/>
+        </w:rPr>
+        <w:t>, p</w:t>
+      </w:r>
+      <w:r>
+        <w:rPr>
+          <w:lang w:val="en-US"/>
+        </w:rPr>
+        <w:t>reprocessing</w:t>
+      </w:r>
+      <w:r>
+        <w:rPr>
+          <w:lang w:val="en-US"/>
+        </w:rPr>
+        <w:t xml:space="preserve"> choices</w:t>
+      </w:r>
+      <w:r>
+        <w:rPr>
+          <w:lang w:val="en-US"/>
+        </w:rPr>
+        <w:t xml:space="preserve"> were hard¸ p</w:t>
+      </w:r>
+      <w:r>
+        <w:rPr>
+          <w:lang w:val="en-US"/>
+        </w:rPr>
+        <w:t>aper som</w:t>
+      </w:r>
+      <w:r>
+        <w:rPr>
+          <w:lang w:val="en-US"/>
+        </w:rPr>
+        <w:t>e</w:t>
+      </w:r>
+      <w:r>
+        <w:rPr>
+          <w:lang w:val="en-US"/>
+        </w:rPr>
+        <w:t>times h</w:t>
+      </w:r>
+      <w:r>
+        <w:rPr>
+          <w:lang w:val="en-GB"/>
+        </w:rPr>
+        <w:t>ard to interpret</w:t>
+      </w:r>
+      <w:r>
+        <w:rPr>
+          <w:lang w:val="en-GB"/>
+        </w:rPr>
+        <w:t xml:space="preserve"> and n</w:t>
+      </w:r>
+      <w:r>
+        <w:rPr>
+          <w:lang w:val="en-GB"/>
+        </w:rPr>
+        <w:t>ot fully reproducible without assumptions</w:t>
       </w:r>
     </w:p>
     <w:p>
@@ -612,67 +1412,21 @@
           <w:numId w:val="2"/>
         </w:numPr>
         <w:rPr>
+          <w:rFonts w:asciiTheme="minorHAnsi" w:hAnsiTheme="minorHAnsi"/>
           <w:sz w:val="24"/>
           <w:szCs w:val="24"/>
-        </w:rPr>
-      </w:pPr>
-      <w:proofErr w:type="spellStart"/>
-      <w:r>
-        <w:rPr>
+          <w:lang w:val="en-US"/>
+        </w:rPr>
+      </w:pPr>
+      <w:r>
+        <w:rPr>
+          <w:rFonts w:asciiTheme="minorHAnsi" w:hAnsiTheme="minorHAnsi"/>
           <w:sz w:val="24"/>
           <w:szCs w:val="24"/>
-        </w:rPr>
-        <w:t>Individual</w:t>
-      </w:r>
-      <w:proofErr w:type="spellEnd"/>
-      <w:r>
-        <w:rPr>
-          <w:sz w:val="24"/>
-          <w:szCs w:val="24"/>
-        </w:rPr>
-        <w:t xml:space="preserve"> </w:t>
-      </w:r>
-      <w:proofErr w:type="spellStart"/>
-      <w:r>
-        <w:rPr>
-          <w:sz w:val="24"/>
-          <w:szCs w:val="24"/>
-        </w:rPr>
-        <w:t>contribution</w:t>
-      </w:r>
-      <w:proofErr w:type="spellEnd"/>
-      <w:r>
-        <w:rPr>
-          <w:sz w:val="24"/>
-          <w:szCs w:val="24"/>
-        </w:rPr>
-        <w:t xml:space="preserve"> </w:t>
-      </w:r>
-      <w:proofErr w:type="spellStart"/>
-      <w:r>
-        <w:rPr>
-          <w:sz w:val="24"/>
-          <w:szCs w:val="24"/>
-        </w:rPr>
-        <w:t>and</w:t>
-      </w:r>
-      <w:proofErr w:type="spellEnd"/>
-      <w:r>
-        <w:rPr>
-          <w:sz w:val="24"/>
-          <w:szCs w:val="24"/>
-        </w:rPr>
-        <w:t xml:space="preserve"> AI-</w:t>
-      </w:r>
-      <w:proofErr w:type="spellStart"/>
-      <w:r>
-        <w:rPr>
-          <w:sz w:val="24"/>
-          <w:szCs w:val="24"/>
-        </w:rPr>
-        <w:t>use</w:t>
-      </w:r>
-      <w:proofErr w:type="spellEnd"/>
+          <w:lang w:val="en-US"/>
+        </w:rPr>
+        <w:t>Individual contribution and AI-use</w:t>
+      </w:r>
     </w:p>
     <w:p>
       <w:pPr>
@@ -697,13 +1451,8 @@
           <w:numId w:val="4"/>
         </w:numPr>
       </w:pPr>
-      <w:proofErr w:type="spellStart"/>
       <w:r>
         <w:t>Contribution</w:t>
-      </w:r>
-      <w:proofErr w:type="spellEnd"/>
-      <w:r>
-        <w:t xml:space="preserve">: </w:t>
       </w:r>
     </w:p>
     <w:p>
@@ -714,13 +1463,8 @@
           <w:numId w:val="4"/>
         </w:numPr>
       </w:pPr>
-      <w:proofErr w:type="spellStart"/>
-      <w:r>
-        <w:t>Describing</w:t>
-      </w:r>
-      <w:proofErr w:type="spellEnd"/>
-      <w:r>
-        <w:t xml:space="preserve"> data</w:t>
+      <w:r>
+        <w:t>Describing data</w:t>
       </w:r>
     </w:p>
     <w:p>
@@ -731,13 +1475,8 @@
           <w:numId w:val="4"/>
         </w:numPr>
       </w:pPr>
-      <w:proofErr w:type="spellStart"/>
-      <w:r>
-        <w:t>Description</w:t>
-      </w:r>
-      <w:proofErr w:type="spellEnd"/>
-      <w:r>
-        <w:t xml:space="preserve"> of pre-processing</w:t>
+      <w:r>
+        <w:t>Description of pre-processing</w:t>
       </w:r>
     </w:p>
     <w:p>
@@ -761,13 +1500,8 @@
         </w:numPr>
       </w:pPr>
       <w:r>
-        <w:t xml:space="preserve">Model </w:t>
-      </w:r>
-      <w:proofErr w:type="spellStart"/>
-      <w:r>
-        <w:t>specification</w:t>
-      </w:r>
-      <w:proofErr w:type="spellEnd"/>
+        <w:t>Model specification</w:t>
+      </w:r>
     </w:p>
     <w:p>
       <w:pPr>
@@ -778,13 +1512,8 @@
         </w:numPr>
       </w:pPr>
       <w:r>
-        <w:t xml:space="preserve">AI </w:t>
-      </w:r>
-      <w:proofErr w:type="spellStart"/>
-      <w:r>
-        <w:t>usage</w:t>
-      </w:r>
-      <w:proofErr w:type="spellEnd"/>
+        <w:t>AI usage</w:t>
+      </w:r>
     </w:p>
     <w:p>
       <w:pPr>
@@ -794,17 +1523,8 @@
           <w:numId w:val="4"/>
         </w:numPr>
       </w:pPr>
-      <w:proofErr w:type="spellStart"/>
-      <w:r>
-        <w:t>Rewriting</w:t>
-      </w:r>
-      <w:proofErr w:type="spellEnd"/>
-      <w:r>
-        <w:t xml:space="preserve"> </w:t>
-      </w:r>
-      <w:proofErr w:type="spellStart"/>
-      <w:r>
-        <w:t>te</w:t>
+      <w:r>
+        <w:t>Rewriting te</w:t>
       </w:r>
       <w:r>
         <w:t>x</w:t>
@@ -812,7 +1532,6 @@
       <w:r>
         <w:t>t</w:t>
       </w:r>
-      <w:proofErr w:type="spellEnd"/>
     </w:p>
     <w:p>
       <w:pPr>
@@ -822,21 +1541,8 @@
           <w:numId w:val="4"/>
         </w:numPr>
       </w:pPr>
-      <w:proofErr w:type="spellStart"/>
-      <w:r>
-        <w:t>Implementing</w:t>
-      </w:r>
-      <w:proofErr w:type="spellEnd"/>
-      <w:r>
-        <w:t xml:space="preserve"> code </w:t>
-      </w:r>
-      <w:proofErr w:type="spellStart"/>
-      <w:r>
-        <w:t>from</w:t>
-      </w:r>
-      <w:proofErr w:type="spellEnd"/>
-      <w:r>
-        <w:t xml:space="preserve"> the internet</w:t>
+      <w:r>
+        <w:t>Implementing code from the internet</w:t>
       </w:r>
     </w:p>
     <w:p>
@@ -854,60 +1560,7 @@
         <w:rPr>
           <w:lang w:val="en-US"/>
         </w:rPr>
-        <w:t>Getting ideas when I didn</w:t>
-      </w:r>
-      <w:r>
-        <w:rPr>
-          <w:lang w:val="en-US"/>
-        </w:rPr>
-        <w:t>’</w:t>
-      </w:r>
-      <w:r>
-        <w:rPr>
-          <w:lang w:val="en-US"/>
-        </w:rPr>
-        <w:t>t k</w:t>
-      </w:r>
-      <w:r>
-        <w:rPr>
-          <w:lang w:val="en-US"/>
-        </w:rPr>
-        <w:t xml:space="preserve">now how to work further. For example, I didn’t understand what the paper meant </w:t>
-      </w:r>
-      <w:proofErr w:type="gramStart"/>
-      <w:r>
-        <w:rPr>
-          <w:lang w:val="en-US"/>
-        </w:rPr>
-        <w:t>with ‘</w:t>
-      </w:r>
-      <w:proofErr w:type="gramEnd"/>
-      <w:r>
-        <w:rPr>
-          <w:lang w:val="en-US"/>
-        </w:rPr>
-        <w:t xml:space="preserve">building a binary classifier for </w:t>
-      </w:r>
-      <w:r>
-        <w:rPr>
-          <w:lang w:val="en-US"/>
-        </w:rPr>
-        <w:lastRenderedPageBreak/>
-        <w:t xml:space="preserve">each of the 10 most populous </w:t>
-      </w:r>
-      <w:proofErr w:type="gramStart"/>
-      <w:r>
-        <w:rPr>
-          <w:lang w:val="en-US"/>
-        </w:rPr>
-        <w:t>classes’</w:t>
-      </w:r>
-      <w:proofErr w:type="gramEnd"/>
-      <w:r>
-        <w:rPr>
-          <w:lang w:val="en-US"/>
-        </w:rPr>
-        <w:t xml:space="preserve">. AI was used to implement this in our own code. </w:t>
+        <w:t xml:space="preserve">Getting ideas when I didn’t know how to work further. For example, I didn’t understand what the paper meant with ‘building a binary classifier for each of the 10 most populous classes’. AI was used to implement this in our own code. </w:t>
       </w:r>
     </w:p>
     <w:p>
@@ -927,19 +1580,232 @@
         </w:rPr>
         <w:t xml:space="preserve">Fixing errors. For example, I didn’t understand how to fix empty tokens. AI was used to </w:t>
       </w:r>
-      <w:proofErr w:type="gramStart"/>
-      <w:r>
-        <w:rPr>
-          <w:lang w:val="en-US"/>
-        </w:rPr>
-        <w:t>understand</w:t>
-      </w:r>
-      <w:proofErr w:type="gramEnd"/>
-      <w:r>
-        <w:rPr>
-          <w:lang w:val="en-US"/>
-        </w:rPr>
-        <w:t xml:space="preserve"> how to remove these. </w:t>
+      <w:r>
+        <w:rPr>
+          <w:lang w:val="en-US"/>
+        </w:rPr>
+        <w:t xml:space="preserve">understand how to remove these. </w:t>
+      </w:r>
+    </w:p>
+    <w:p>
+      <w:pPr>
+        <w:rPr>
+          <w:lang w:val="en-US"/>
+        </w:rPr>
+      </w:pPr>
+      <w:r>
+        <w:rPr>
+          <w:lang w:val="en-US"/>
+        </w:rPr>
+        <w:br w:type="page"/>
+      </w:r>
+    </w:p>
+    <w:p>
+      <w:pPr>
+        <w:rPr>
+          <w:i/>
+          <w:iCs/>
+        </w:rPr>
+      </w:pPr>
+      <w:r>
+        <w:rPr>
+          <w:i/>
+          <w:iCs/>
+        </w:rPr>
+        <w:lastRenderedPageBreak/>
+        <w:t>Jessie</w:t>
+      </w:r>
+    </w:p>
+    <w:p>
+      <w:pPr>
+        <w:pStyle w:val="Lijstalinea"/>
+        <w:numPr>
+          <w:ilvl w:val="0"/>
+          <w:numId w:val="4"/>
+        </w:numPr>
+      </w:pPr>
+      <w:r>
+        <w:t>Contribution</w:t>
+      </w:r>
+    </w:p>
+    <w:p>
+      <w:pPr>
+        <w:pStyle w:val="Lijstalinea"/>
+        <w:numPr>
+          <w:ilvl w:val="1"/>
+          <w:numId w:val="4"/>
+        </w:numPr>
+        <w:rPr>
+          <w:lang w:val="en-US"/>
+        </w:rPr>
+      </w:pPr>
+      <w:r>
+        <w:rPr>
+          <w:lang w:val="en-US"/>
+        </w:rPr>
+        <w:t>Implemented ML pipeline: train/test split, binary labels for the top 10 topics, feature vectorization, and training both MultinomialNB and BernoulliNB models.</w:t>
+      </w:r>
+    </w:p>
+    <w:p>
+      <w:pPr>
+        <w:pStyle w:val="Lijstalinea"/>
+        <w:numPr>
+          <w:ilvl w:val="1"/>
+          <w:numId w:val="4"/>
+        </w:numPr>
+        <w:rPr>
+          <w:lang w:val="en-US"/>
+        </w:rPr>
+      </w:pPr>
+      <w:r>
+        <w:rPr>
+          <w:lang w:val="en-US"/>
+        </w:rPr>
+        <w:t>Calculated evaluation metrics</w:t>
+      </w:r>
+      <w:r>
+        <w:rPr>
+          <w:lang w:val="en-US"/>
+        </w:rPr>
+        <w:t xml:space="preserve"> </w:t>
+      </w:r>
+      <w:r>
+        <w:rPr>
+          <w:lang w:val="en-US"/>
+        </w:rPr>
+        <w:t>and generated summary tables and plots</w:t>
+      </w:r>
+      <w:r>
+        <w:rPr>
+          <w:lang w:val="en-US"/>
+        </w:rPr>
+        <w:t>.</w:t>
+      </w:r>
+    </w:p>
+    <w:p>
+      <w:pPr>
+        <w:pStyle w:val="Lijstalinea"/>
+        <w:numPr>
+          <w:ilvl w:val="1"/>
+          <w:numId w:val="4"/>
+        </w:numPr>
+        <w:rPr>
+          <w:lang w:val="en-US"/>
+        </w:rPr>
+      </w:pPr>
+      <w:r>
+        <w:rPr>
+          <w:lang w:val="en-US"/>
+        </w:rPr>
+        <w:t>Drafted model specification, training, evaluation, results, discussion, and reflection in keywords.</w:t>
+      </w:r>
+    </w:p>
+    <w:p>
+      <w:pPr>
+        <w:pStyle w:val="Lijstalinea"/>
+        <w:numPr>
+          <w:ilvl w:val="0"/>
+          <w:numId w:val="4"/>
+        </w:numPr>
+      </w:pPr>
+      <w:r>
+        <w:t>AI usage:</w:t>
+      </w:r>
+    </w:p>
+    <w:p>
+      <w:pPr>
+        <w:pStyle w:val="Lijstalinea"/>
+        <w:numPr>
+          <w:ilvl w:val="1"/>
+          <w:numId w:val="4"/>
+        </w:numPr>
+        <w:rPr>
+          <w:lang w:val="en-US"/>
+        </w:rPr>
+      </w:pPr>
+      <w:r>
+        <w:rPr>
+          <w:lang w:val="en-US"/>
+        </w:rPr>
+        <w:t xml:space="preserve">Used to add </w:t>
+      </w:r>
+      <w:r>
+        <w:rPr>
+          <w:lang w:val="en-US"/>
+        </w:rPr>
+        <w:t>comments and docstrings to code.</w:t>
+      </w:r>
+    </w:p>
+    <w:p>
+      <w:pPr>
+        <w:pStyle w:val="Lijstalinea"/>
+        <w:numPr>
+          <w:ilvl w:val="1"/>
+          <w:numId w:val="4"/>
+        </w:numPr>
+        <w:rPr>
+          <w:lang w:val="en-US"/>
+        </w:rPr>
+      </w:pPr>
+      <w:r>
+        <w:rPr>
+          <w:lang w:val="en-US"/>
+        </w:rPr>
+        <w:t>Helped debug minor issues (e.g., handling empty tokens, fixing type warnings).</w:t>
+      </w:r>
+    </w:p>
+    <w:p>
+      <w:pPr>
+        <w:pStyle w:val="Lijstalinea"/>
+        <w:numPr>
+          <w:ilvl w:val="1"/>
+          <w:numId w:val="4"/>
+        </w:numPr>
+        <w:rPr>
+          <w:lang w:val="en-US"/>
+        </w:rPr>
+      </w:pPr>
+      <w:r>
+        <w:rPr>
+          <w:lang w:val="en-US"/>
+        </w:rPr>
+        <w:t>Used to c</w:t>
+      </w:r>
+      <w:r>
+        <w:rPr>
+          <w:lang w:val="en-US"/>
+        </w:rPr>
+        <w:t>larif</w:t>
+      </w:r>
+      <w:r>
+        <w:rPr>
+          <w:lang w:val="en-US"/>
+        </w:rPr>
+        <w:t>y</w:t>
+      </w:r>
+      <w:r>
+        <w:rPr>
+          <w:lang w:val="en-US"/>
+        </w:rPr>
+        <w:t xml:space="preserve"> differences between MultinomialNB and BernoulliNB implementation details.</w:t>
+      </w:r>
+    </w:p>
+    <w:p>
+      <w:pPr>
+        <w:pStyle w:val="Lijstalinea"/>
+        <w:numPr>
+          <w:ilvl w:val="1"/>
+          <w:numId w:val="4"/>
+        </w:numPr>
+        <w:rPr>
+          <w:lang w:val="en-US"/>
+        </w:rPr>
+      </w:pPr>
+      <w:r>
+        <w:rPr>
+          <w:lang w:val="en-US"/>
+        </w:rPr>
+        <w:t>Suggested improvements in evaluation workflow and visualization.</w:t>
       </w:r>
     </w:p>
     <w:sectPr>
@@ -955,6 +1821,343 @@
 <file path=word/numbering.xml><?xml version="1.0" encoding="utf-8"?>
 <w:numbering xmlns:wpc="http://schemas.microsoft.com/office/word/2010/wordprocessingCanvas" xmlns:cx="http://schemas.microsoft.com/office/drawing/2014/chartex" xmlns:cx1="http://schemas.microsoft.com/office/drawing/2015/9/8/chartex" xmlns:cx2="http://schemas.microsoft.com/office/drawing/2015/10/21/chartex" xmlns:cx3="http://schemas.microsoft.com/office/drawing/2016/5/9/chartex" xmlns:cx4="http://schemas.microsoft.com/office/drawing/2016/5/10/chartex" xmlns:cx5="http://schemas.microsoft.com/office/drawing/2016/5/11/chartex" xmlns:cx6="http://schemas.microsoft.com/office/drawing/2016/5/12/chartex" xmlns:cx7="http://schemas.microsoft.com/office/drawing/2016/5/13/chartex" xmlns:cx8="http://schemas.microsoft.com/office/drawing/2016/5/14/chartex" xmlns:mc="http://schemas.openxmlformats.org/markup-compatibility/2006" xmlns:aink="http://schemas.microsoft.com/office/drawing/2016/ink" xmlns:am3d="http://schemas.microsoft.com/office/drawing/2017/model3d" xmlns:o="urn:schemas-microsoft-com:office:office" xmlns:oel="http://schemas.microsoft.com/office/2019/extlst" xmlns:r="http://schemas.openxmlformats.org/officeDocument/2006/relationships" xmlns:m="http://schemas.openxmlformats.org/officeDocument/2006/math" xmlns:v="urn:schemas-microsoft-com:vml" xmlns:wp14="http://schemas.microsoft.com/office/word/2010/wordprocessingDrawing" xmlns:wp="http://schemas.openxmlformats.org/drawingml/2006/wordprocessingDrawing" xmlns:w10="urn:schemas-microsoft-com:office:word" xmlns:w="http://schemas.openxmlformats.org/wordprocessingml/2006/main" xmlns:w14="http://schemas.microsoft.com/office/word/2010/wordml" xmlns:w15="http://schemas.microsoft.com/office/word/2012/wordml" xmlns:w16cex="http://schemas.microsoft.com/office/word/2018/wordml/cex" xmlns:w16cid="http://schemas.microsoft.com/office/word/2016/wordml/cid" xmlns:w16="http://schemas.microsoft.com/office/word/2018/wordml" xmlns:w16du="http://schemas.microsoft.com/office/word/2023/wordml/word16du" xmlns:w16sdtdh="http://schemas.microsoft.com/office/word/2020/wordml/sdtdatahash" xmlns:w16sdtfl="http://schemas.microsoft.com/office/word/2024/wordml/sdtformatlock" xmlns:w16se="http://schemas.microsoft.com/office/word/2015/wordml/symex" xmlns:wpg="http://schemas.microsoft.com/office/word/2010/wordprocessingGroup" xmlns:wpi="http://schemas.microsoft.com/office/word/2010/wordprocessingInk" xmlns:wne="http://schemas.microsoft.com/office/word/2006/wordml" xmlns:wps="http://schemas.microsoft.com/office/word/2010/wordprocessingShape" mc:Ignorable="w14 w15 w16se w16cid w16 w16cex w16sdtdh w16sdtfl w16du wp14">
   <w:abstractNum w:abstractNumId="0" w15:restartNumberingAfterBreak="0">
+    <w:nsid w:val="012E5FE4"/>
+    <w:multiLevelType w:val="hybridMultilevel"/>
+    <w:tmpl w:val="D556F2CE"/>
+    <w:lvl w:ilvl="0" w:tplc="9A0A08D8">
+      <w:numFmt w:val="bullet"/>
+      <w:lvlText w:val="•"/>
+      <w:lvlJc w:val="left"/>
+      <w:pPr>
+        <w:ind w:left="1068" w:hanging="708"/>
+      </w:pPr>
+      <w:rPr>
+        <w:rFonts w:ascii="Aptos" w:eastAsiaTheme="minorHAnsi" w:hAnsi="Aptos" w:cstheme="minorBidi" w:hint="default"/>
+      </w:rPr>
+    </w:lvl>
+    <w:lvl w:ilvl="1" w:tplc="04130003" w:tentative="1">
+      <w:start w:val="1"/>
+      <w:numFmt w:val="bullet"/>
+      <w:lvlText w:val="o"/>
+      <w:lvlJc w:val="left"/>
+      <w:pPr>
+        <w:ind w:left="1440" w:hanging="360"/>
+      </w:pPr>
+      <w:rPr>
+        <w:rFonts w:ascii="Courier New" w:hAnsi="Courier New" w:cs="Courier New" w:hint="default"/>
+      </w:rPr>
+    </w:lvl>
+    <w:lvl w:ilvl="2" w:tplc="04130005" w:tentative="1">
+      <w:start w:val="1"/>
+      <w:numFmt w:val="bullet"/>
+      <w:lvlText w:val=""/>
+      <w:lvlJc w:val="left"/>
+      <w:pPr>
+        <w:ind w:left="2160" w:hanging="360"/>
+      </w:pPr>
+      <w:rPr>
+        <w:rFonts w:ascii="Wingdings" w:hAnsi="Wingdings" w:hint="default"/>
+      </w:rPr>
+    </w:lvl>
+    <w:lvl w:ilvl="3" w:tplc="04130001" w:tentative="1">
+      <w:start w:val="1"/>
+      <w:numFmt w:val="bullet"/>
+      <w:lvlText w:val=""/>
+      <w:lvlJc w:val="left"/>
+      <w:pPr>
+        <w:ind w:left="2880" w:hanging="360"/>
+      </w:pPr>
+      <w:rPr>
+        <w:rFonts w:ascii="Symbol" w:hAnsi="Symbol" w:hint="default"/>
+      </w:rPr>
+    </w:lvl>
+    <w:lvl w:ilvl="4" w:tplc="04130003" w:tentative="1">
+      <w:start w:val="1"/>
+      <w:numFmt w:val="bullet"/>
+      <w:lvlText w:val="o"/>
+      <w:lvlJc w:val="left"/>
+      <w:pPr>
+        <w:ind w:left="3600" w:hanging="360"/>
+      </w:pPr>
+      <w:rPr>
+        <w:rFonts w:ascii="Courier New" w:hAnsi="Courier New" w:cs="Courier New" w:hint="default"/>
+      </w:rPr>
+    </w:lvl>
+    <w:lvl w:ilvl="5" w:tplc="04130005" w:tentative="1">
+      <w:start w:val="1"/>
+      <w:numFmt w:val="bullet"/>
+      <w:lvlText w:val=""/>
+      <w:lvlJc w:val="left"/>
+      <w:pPr>
+        <w:ind w:left="4320" w:hanging="360"/>
+      </w:pPr>
+      <w:rPr>
+        <w:rFonts w:ascii="Wingdings" w:hAnsi="Wingdings" w:hint="default"/>
+      </w:rPr>
+    </w:lvl>
+    <w:lvl w:ilvl="6" w:tplc="04130001" w:tentative="1">
+      <w:start w:val="1"/>
+      <w:numFmt w:val="bullet"/>
+      <w:lvlText w:val=""/>
+      <w:lvlJc w:val="left"/>
+      <w:pPr>
+        <w:ind w:left="5040" w:hanging="360"/>
+      </w:pPr>
+      <w:rPr>
+        <w:rFonts w:ascii="Symbol" w:hAnsi="Symbol" w:hint="default"/>
+      </w:rPr>
+    </w:lvl>
+    <w:lvl w:ilvl="7" w:tplc="04130003" w:tentative="1">
+      <w:start w:val="1"/>
+      <w:numFmt w:val="bullet"/>
+      <w:lvlText w:val="o"/>
+      <w:lvlJc w:val="left"/>
+      <w:pPr>
+        <w:ind w:left="5760" w:hanging="360"/>
+      </w:pPr>
+      <w:rPr>
+        <w:rFonts w:ascii="Courier New" w:hAnsi="Courier New" w:cs="Courier New" w:hint="default"/>
+      </w:rPr>
+    </w:lvl>
+    <w:lvl w:ilvl="8" w:tplc="04130005" w:tentative="1">
+      <w:start w:val="1"/>
+      <w:numFmt w:val="bullet"/>
+      <w:lvlText w:val=""/>
+      <w:lvlJc w:val="left"/>
+      <w:pPr>
+        <w:ind w:left="6480" w:hanging="360"/>
+      </w:pPr>
+      <w:rPr>
+        <w:rFonts w:ascii="Wingdings" w:hAnsi="Wingdings" w:hint="default"/>
+      </w:rPr>
+    </w:lvl>
+  </w:abstractNum>
+  <w:abstractNum w:abstractNumId="1" w15:restartNumberingAfterBreak="0">
+    <w:nsid w:val="02965C87"/>
+    <w:multiLevelType w:val="hybridMultilevel"/>
+    <w:tmpl w:val="D86427E0"/>
+    <w:lvl w:ilvl="0" w:tplc="04130001">
+      <w:start w:val="1"/>
+      <w:numFmt w:val="bullet"/>
+      <w:lvlText w:val=""/>
+      <w:lvlJc w:val="left"/>
+      <w:pPr>
+        <w:ind w:left="720" w:hanging="360"/>
+      </w:pPr>
+      <w:rPr>
+        <w:rFonts w:ascii="Symbol" w:hAnsi="Symbol" w:hint="default"/>
+      </w:rPr>
+    </w:lvl>
+    <w:lvl w:ilvl="1" w:tplc="04130003" w:tentative="1">
+      <w:start w:val="1"/>
+      <w:numFmt w:val="bullet"/>
+      <w:lvlText w:val="o"/>
+      <w:lvlJc w:val="left"/>
+      <w:pPr>
+        <w:ind w:left="1440" w:hanging="360"/>
+      </w:pPr>
+      <w:rPr>
+        <w:rFonts w:ascii="Courier New" w:hAnsi="Courier New" w:cs="Courier New" w:hint="default"/>
+      </w:rPr>
+    </w:lvl>
+    <w:lvl w:ilvl="2" w:tplc="04130005" w:tentative="1">
+      <w:start w:val="1"/>
+      <w:numFmt w:val="bullet"/>
+      <w:lvlText w:val=""/>
+      <w:lvlJc w:val="left"/>
+      <w:pPr>
+        <w:ind w:left="2160" w:hanging="360"/>
+      </w:pPr>
+      <w:rPr>
+        <w:rFonts w:ascii="Wingdings" w:hAnsi="Wingdings" w:hint="default"/>
+      </w:rPr>
+    </w:lvl>
+    <w:lvl w:ilvl="3" w:tplc="04130001" w:tentative="1">
+      <w:start w:val="1"/>
+      <w:numFmt w:val="bullet"/>
+      <w:lvlText w:val=""/>
+      <w:lvlJc w:val="left"/>
+      <w:pPr>
+        <w:ind w:left="2880" w:hanging="360"/>
+      </w:pPr>
+      <w:rPr>
+        <w:rFonts w:ascii="Symbol" w:hAnsi="Symbol" w:hint="default"/>
+      </w:rPr>
+    </w:lvl>
+    <w:lvl w:ilvl="4" w:tplc="04130003" w:tentative="1">
+      <w:start w:val="1"/>
+      <w:numFmt w:val="bullet"/>
+      <w:lvlText w:val="o"/>
+      <w:lvlJc w:val="left"/>
+      <w:pPr>
+        <w:ind w:left="3600" w:hanging="360"/>
+      </w:pPr>
+      <w:rPr>
+        <w:rFonts w:ascii="Courier New" w:hAnsi="Courier New" w:cs="Courier New" w:hint="default"/>
+      </w:rPr>
+    </w:lvl>
+    <w:lvl w:ilvl="5" w:tplc="04130005" w:tentative="1">
+      <w:start w:val="1"/>
+      <w:numFmt w:val="bullet"/>
+      <w:lvlText w:val=""/>
+      <w:lvlJc w:val="left"/>
+      <w:pPr>
+        <w:ind w:left="4320" w:hanging="360"/>
+      </w:pPr>
+      <w:rPr>
+        <w:rFonts w:ascii="Wingdings" w:hAnsi="Wingdings" w:hint="default"/>
+      </w:rPr>
+    </w:lvl>
+    <w:lvl w:ilvl="6" w:tplc="04130001" w:tentative="1">
+      <w:start w:val="1"/>
+      <w:numFmt w:val="bullet"/>
+      <w:lvlText w:val=""/>
+      <w:lvlJc w:val="left"/>
+      <w:pPr>
+        <w:ind w:left="5040" w:hanging="360"/>
+      </w:pPr>
+      <w:rPr>
+        <w:rFonts w:ascii="Symbol" w:hAnsi="Symbol" w:hint="default"/>
+      </w:rPr>
+    </w:lvl>
+    <w:lvl w:ilvl="7" w:tplc="04130003" w:tentative="1">
+      <w:start w:val="1"/>
+      <w:numFmt w:val="bullet"/>
+      <w:lvlText w:val="o"/>
+      <w:lvlJc w:val="left"/>
+      <w:pPr>
+        <w:ind w:left="5760" w:hanging="360"/>
+      </w:pPr>
+      <w:rPr>
+        <w:rFonts w:ascii="Courier New" w:hAnsi="Courier New" w:cs="Courier New" w:hint="default"/>
+      </w:rPr>
+    </w:lvl>
+    <w:lvl w:ilvl="8" w:tplc="04130005" w:tentative="1">
+      <w:start w:val="1"/>
+      <w:numFmt w:val="bullet"/>
+      <w:lvlText w:val=""/>
+      <w:lvlJc w:val="left"/>
+      <w:pPr>
+        <w:ind w:left="6480" w:hanging="360"/>
+      </w:pPr>
+      <w:rPr>
+        <w:rFonts w:ascii="Wingdings" w:hAnsi="Wingdings" w:hint="default"/>
+      </w:rPr>
+    </w:lvl>
+  </w:abstractNum>
+  <w:abstractNum w:abstractNumId="2" w15:restartNumberingAfterBreak="0">
+    <w:nsid w:val="11F63CC2"/>
+    <w:multiLevelType w:val="hybridMultilevel"/>
+    <w:tmpl w:val="28A0D1FA"/>
+    <w:lvl w:ilvl="0" w:tplc="9A0A08D8">
+      <w:numFmt w:val="bullet"/>
+      <w:lvlText w:val="•"/>
+      <w:lvlJc w:val="left"/>
+      <w:pPr>
+        <w:ind w:left="1068" w:hanging="708"/>
+      </w:pPr>
+      <w:rPr>
+        <w:rFonts w:ascii="Aptos" w:eastAsiaTheme="minorHAnsi" w:hAnsi="Aptos" w:cstheme="minorBidi" w:hint="default"/>
+      </w:rPr>
+    </w:lvl>
+    <w:lvl w:ilvl="1" w:tplc="04130003" w:tentative="1">
+      <w:start w:val="1"/>
+      <w:numFmt w:val="bullet"/>
+      <w:lvlText w:val="o"/>
+      <w:lvlJc w:val="left"/>
+      <w:pPr>
+        <w:ind w:left="1440" w:hanging="360"/>
+      </w:pPr>
+      <w:rPr>
+        <w:rFonts w:ascii="Courier New" w:hAnsi="Courier New" w:cs="Courier New" w:hint="default"/>
+      </w:rPr>
+    </w:lvl>
+    <w:lvl w:ilvl="2" w:tplc="04130005" w:tentative="1">
+      <w:start w:val="1"/>
+      <w:numFmt w:val="bullet"/>
+      <w:lvlText w:val=""/>
+      <w:lvlJc w:val="left"/>
+      <w:pPr>
+        <w:ind w:left="2160" w:hanging="360"/>
+      </w:pPr>
+      <w:rPr>
+        <w:rFonts w:ascii="Wingdings" w:hAnsi="Wingdings" w:hint="default"/>
+      </w:rPr>
+    </w:lvl>
+    <w:lvl w:ilvl="3" w:tplc="04130001" w:tentative="1">
+      <w:start w:val="1"/>
+      <w:numFmt w:val="bullet"/>
+      <w:lvlText w:val=""/>
+      <w:lvlJc w:val="left"/>
+      <w:pPr>
+        <w:ind w:left="2880" w:hanging="360"/>
+      </w:pPr>
+      <w:rPr>
+        <w:rFonts w:ascii="Symbol" w:hAnsi="Symbol" w:hint="default"/>
+      </w:rPr>
+    </w:lvl>
+    <w:lvl w:ilvl="4" w:tplc="04130003" w:tentative="1">
+      <w:start w:val="1"/>
+      <w:numFmt w:val="bullet"/>
+      <w:lvlText w:val="o"/>
+      <w:lvlJc w:val="left"/>
+      <w:pPr>
+        <w:ind w:left="3600" w:hanging="360"/>
+      </w:pPr>
+      <w:rPr>
+        <w:rFonts w:ascii="Courier New" w:hAnsi="Courier New" w:cs="Courier New" w:hint="default"/>
+      </w:rPr>
+    </w:lvl>
+    <w:lvl w:ilvl="5" w:tplc="04130005" w:tentative="1">
+      <w:start w:val="1"/>
+      <w:numFmt w:val="bullet"/>
+      <w:lvlText w:val=""/>
+      <w:lvlJc w:val="left"/>
+      <w:pPr>
+        <w:ind w:left="4320" w:hanging="360"/>
+      </w:pPr>
+      <w:rPr>
+        <w:rFonts w:ascii="Wingdings" w:hAnsi="Wingdings" w:hint="default"/>
+      </w:rPr>
+    </w:lvl>
+    <w:lvl w:ilvl="6" w:tplc="04130001" w:tentative="1">
+      <w:start w:val="1"/>
+      <w:numFmt w:val="bullet"/>
+      <w:lvlText w:val=""/>
+      <w:lvlJc w:val="left"/>
+      <w:pPr>
+        <w:ind w:left="5040" w:hanging="360"/>
+      </w:pPr>
+      <w:rPr>
+        <w:rFonts w:ascii="Symbol" w:hAnsi="Symbol" w:hint="default"/>
+      </w:rPr>
+    </w:lvl>
+    <w:lvl w:ilvl="7" w:tplc="04130003" w:tentative="1">
+      <w:start w:val="1"/>
+      <w:numFmt w:val="bullet"/>
+      <w:lvlText w:val="o"/>
+      <w:lvlJc w:val="left"/>
+      <w:pPr>
+        <w:ind w:left="5760" w:hanging="360"/>
+      </w:pPr>
+      <w:rPr>
+        <w:rFonts w:ascii="Courier New" w:hAnsi="Courier New" w:cs="Courier New" w:hint="default"/>
+      </w:rPr>
+    </w:lvl>
+    <w:lvl w:ilvl="8" w:tplc="04130005" w:tentative="1">
+      <w:start w:val="1"/>
+      <w:numFmt w:val="bullet"/>
+      <w:lvlText w:val=""/>
+      <w:lvlJc w:val="left"/>
+      <w:pPr>
+        <w:ind w:left="6480" w:hanging="360"/>
+      </w:pPr>
+      <w:rPr>
+        <w:rFonts w:ascii="Wingdings" w:hAnsi="Wingdings" w:hint="default"/>
+      </w:rPr>
+    </w:lvl>
+  </w:abstractNum>
+  <w:abstractNum w:abstractNumId="3" w15:restartNumberingAfterBreak="0">
     <w:nsid w:val="14496225"/>
     <w:multiLevelType w:val="hybridMultilevel"/>
     <w:tmpl w:val="F996B8A8"/>
@@ -1040,7 +2243,7 @@
       </w:pPr>
     </w:lvl>
   </w:abstractNum>
-  <w:abstractNum w:abstractNumId="1" w15:restartNumberingAfterBreak="0">
+  <w:abstractNum w:abstractNumId="4" w15:restartNumberingAfterBreak="0">
     <w:nsid w:val="233861FB"/>
     <w:multiLevelType w:val="hybridMultilevel"/>
     <w:tmpl w:val="3176CD2E"/>
@@ -1129,7 +2332,119 @@
       </w:pPr>
     </w:lvl>
   </w:abstractNum>
-  <w:abstractNum w:abstractNumId="2" w15:restartNumberingAfterBreak="0">
+  <w:abstractNum w:abstractNumId="5" w15:restartNumberingAfterBreak="0">
+    <w:nsid w:val="24A804B8"/>
+    <w:multiLevelType w:val="hybridMultilevel"/>
+    <w:tmpl w:val="8990CA04"/>
+    <w:lvl w:ilvl="0" w:tplc="9A0A08D8">
+      <w:numFmt w:val="bullet"/>
+      <w:lvlText w:val="•"/>
+      <w:lvlJc w:val="left"/>
+      <w:pPr>
+        <w:ind w:left="1068" w:hanging="708"/>
+      </w:pPr>
+      <w:rPr>
+        <w:rFonts w:ascii="Aptos" w:eastAsiaTheme="minorHAnsi" w:hAnsi="Aptos" w:cstheme="minorBidi" w:hint="default"/>
+      </w:rPr>
+    </w:lvl>
+    <w:lvl w:ilvl="1" w:tplc="04130003" w:tentative="1">
+      <w:start w:val="1"/>
+      <w:numFmt w:val="bullet"/>
+      <w:lvlText w:val="o"/>
+      <w:lvlJc w:val="left"/>
+      <w:pPr>
+        <w:ind w:left="1440" w:hanging="360"/>
+      </w:pPr>
+      <w:rPr>
+        <w:rFonts w:ascii="Courier New" w:hAnsi="Courier New" w:cs="Courier New" w:hint="default"/>
+      </w:rPr>
+    </w:lvl>
+    <w:lvl w:ilvl="2" w:tplc="04130005" w:tentative="1">
+      <w:start w:val="1"/>
+      <w:numFmt w:val="bullet"/>
+      <w:lvlText w:val=""/>
+      <w:lvlJc w:val="left"/>
+      <w:pPr>
+        <w:ind w:left="2160" w:hanging="360"/>
+      </w:pPr>
+      <w:rPr>
+        <w:rFonts w:ascii="Wingdings" w:hAnsi="Wingdings" w:hint="default"/>
+      </w:rPr>
+    </w:lvl>
+    <w:lvl w:ilvl="3" w:tplc="04130001" w:tentative="1">
+      <w:start w:val="1"/>
+      <w:numFmt w:val="bullet"/>
+      <w:lvlText w:val=""/>
+      <w:lvlJc w:val="left"/>
+      <w:pPr>
+        <w:ind w:left="2880" w:hanging="360"/>
+      </w:pPr>
+      <w:rPr>
+        <w:rFonts w:ascii="Symbol" w:hAnsi="Symbol" w:hint="default"/>
+      </w:rPr>
+    </w:lvl>
+    <w:lvl w:ilvl="4" w:tplc="04130003" w:tentative="1">
+      <w:start w:val="1"/>
+      <w:numFmt w:val="bullet"/>
+      <w:lvlText w:val="o"/>
+      <w:lvlJc w:val="left"/>
+      <w:pPr>
+        <w:ind w:left="3600" w:hanging="360"/>
+      </w:pPr>
+      <w:rPr>
+        <w:rFonts w:ascii="Courier New" w:hAnsi="Courier New" w:cs="Courier New" w:hint="default"/>
+      </w:rPr>
+    </w:lvl>
+    <w:lvl w:ilvl="5" w:tplc="04130005" w:tentative="1">
+      <w:start w:val="1"/>
+      <w:numFmt w:val="bullet"/>
+      <w:lvlText w:val=""/>
+      <w:lvlJc w:val="left"/>
+      <w:pPr>
+        <w:ind w:left="4320" w:hanging="360"/>
+      </w:pPr>
+      <w:rPr>
+        <w:rFonts w:ascii="Wingdings" w:hAnsi="Wingdings" w:hint="default"/>
+      </w:rPr>
+    </w:lvl>
+    <w:lvl w:ilvl="6" w:tplc="04130001" w:tentative="1">
+      <w:start w:val="1"/>
+      <w:numFmt w:val="bullet"/>
+      <w:lvlText w:val=""/>
+      <w:lvlJc w:val="left"/>
+      <w:pPr>
+        <w:ind w:left="5040" w:hanging="360"/>
+      </w:pPr>
+      <w:rPr>
+        <w:rFonts w:ascii="Symbol" w:hAnsi="Symbol" w:hint="default"/>
+      </w:rPr>
+    </w:lvl>
+    <w:lvl w:ilvl="7" w:tplc="04130003" w:tentative="1">
+      <w:start w:val="1"/>
+      <w:numFmt w:val="bullet"/>
+      <w:lvlText w:val="o"/>
+      <w:lvlJc w:val="left"/>
+      <w:pPr>
+        <w:ind w:left="5760" w:hanging="360"/>
+      </w:pPr>
+      <w:rPr>
+        <w:rFonts w:ascii="Courier New" w:hAnsi="Courier New" w:cs="Courier New" w:hint="default"/>
+      </w:rPr>
+    </w:lvl>
+    <w:lvl w:ilvl="8" w:tplc="04130005" w:tentative="1">
+      <w:start w:val="1"/>
+      <w:numFmt w:val="bullet"/>
+      <w:lvlText w:val=""/>
+      <w:lvlJc w:val="left"/>
+      <w:pPr>
+        <w:ind w:left="6480" w:hanging="360"/>
+      </w:pPr>
+      <w:rPr>
+        <w:rFonts w:ascii="Wingdings" w:hAnsi="Wingdings" w:hint="default"/>
+      </w:rPr>
+    </w:lvl>
+  </w:abstractNum>
+  <w:abstractNum w:abstractNumId="6" w15:restartNumberingAfterBreak="0">
     <w:nsid w:val="29BA7459"/>
     <w:multiLevelType w:val="hybridMultilevel"/>
     <w:tmpl w:val="E586C854"/>
@@ -1215,7 +2530,230 @@
       </w:pPr>
     </w:lvl>
   </w:abstractNum>
-  <w:abstractNum w:abstractNumId="3" w15:restartNumberingAfterBreak="0">
+  <w:abstractNum w:abstractNumId="7" w15:restartNumberingAfterBreak="0">
+    <w:nsid w:val="2B842546"/>
+    <w:multiLevelType w:val="hybridMultilevel"/>
+    <w:tmpl w:val="5712B8E0"/>
+    <w:lvl w:ilvl="0" w:tplc="9A0A08D8">
+      <w:numFmt w:val="bullet"/>
+      <w:lvlText w:val="•"/>
+      <w:lvlJc w:val="left"/>
+      <w:pPr>
+        <w:ind w:left="1068" w:hanging="708"/>
+      </w:pPr>
+      <w:rPr>
+        <w:rFonts w:ascii="Aptos" w:eastAsiaTheme="minorHAnsi" w:hAnsi="Aptos" w:cstheme="minorBidi" w:hint="default"/>
+      </w:rPr>
+    </w:lvl>
+    <w:lvl w:ilvl="1" w:tplc="04130003" w:tentative="1">
+      <w:start w:val="1"/>
+      <w:numFmt w:val="bullet"/>
+      <w:lvlText w:val="o"/>
+      <w:lvlJc w:val="left"/>
+      <w:pPr>
+        <w:ind w:left="1440" w:hanging="360"/>
+      </w:pPr>
+      <w:rPr>
+        <w:rFonts w:ascii="Courier New" w:hAnsi="Courier New" w:cs="Courier New" w:hint="default"/>
+      </w:rPr>
+    </w:lvl>
+    <w:lvl w:ilvl="2" w:tplc="04130005" w:tentative="1">
+      <w:start w:val="1"/>
+      <w:numFmt w:val="bullet"/>
+      <w:lvlText w:val=""/>
+      <w:lvlJc w:val="left"/>
+      <w:pPr>
+        <w:ind w:left="2160" w:hanging="360"/>
+      </w:pPr>
+      <w:rPr>
+        <w:rFonts w:ascii="Wingdings" w:hAnsi="Wingdings" w:hint="default"/>
+      </w:rPr>
+    </w:lvl>
+    <w:lvl w:ilvl="3" w:tplc="04130001" w:tentative="1">
+      <w:start w:val="1"/>
+      <w:numFmt w:val="bullet"/>
+      <w:lvlText w:val=""/>
+      <w:lvlJc w:val="left"/>
+      <w:pPr>
+        <w:ind w:left="2880" w:hanging="360"/>
+      </w:pPr>
+      <w:rPr>
+        <w:rFonts w:ascii="Symbol" w:hAnsi="Symbol" w:hint="default"/>
+      </w:rPr>
+    </w:lvl>
+    <w:lvl w:ilvl="4" w:tplc="04130003" w:tentative="1">
+      <w:start w:val="1"/>
+      <w:numFmt w:val="bullet"/>
+      <w:lvlText w:val="o"/>
+      <w:lvlJc w:val="left"/>
+      <w:pPr>
+        <w:ind w:left="3600" w:hanging="360"/>
+      </w:pPr>
+      <w:rPr>
+        <w:rFonts w:ascii="Courier New" w:hAnsi="Courier New" w:cs="Courier New" w:hint="default"/>
+      </w:rPr>
+    </w:lvl>
+    <w:lvl w:ilvl="5" w:tplc="04130005" w:tentative="1">
+      <w:start w:val="1"/>
+      <w:numFmt w:val="bullet"/>
+      <w:lvlText w:val=""/>
+      <w:lvlJc w:val="left"/>
+      <w:pPr>
+        <w:ind w:left="4320" w:hanging="360"/>
+      </w:pPr>
+      <w:rPr>
+        <w:rFonts w:ascii="Wingdings" w:hAnsi="Wingdings" w:hint="default"/>
+      </w:rPr>
+    </w:lvl>
+    <w:lvl w:ilvl="6" w:tplc="04130001" w:tentative="1">
+      <w:start w:val="1"/>
+      <w:numFmt w:val="bullet"/>
+      <w:lvlText w:val=""/>
+      <w:lvlJc w:val="left"/>
+      <w:pPr>
+        <w:ind w:left="5040" w:hanging="360"/>
+      </w:pPr>
+      <w:rPr>
+        <w:rFonts w:ascii="Symbol" w:hAnsi="Symbol" w:hint="default"/>
+      </w:rPr>
+    </w:lvl>
+    <w:lvl w:ilvl="7" w:tplc="04130003" w:tentative="1">
+      <w:start w:val="1"/>
+      <w:numFmt w:val="bullet"/>
+      <w:lvlText w:val="o"/>
+      <w:lvlJc w:val="left"/>
+      <w:pPr>
+        <w:ind w:left="5760" w:hanging="360"/>
+      </w:pPr>
+      <w:rPr>
+        <w:rFonts w:ascii="Courier New" w:hAnsi="Courier New" w:cs="Courier New" w:hint="default"/>
+      </w:rPr>
+    </w:lvl>
+    <w:lvl w:ilvl="8" w:tplc="04130005" w:tentative="1">
+      <w:start w:val="1"/>
+      <w:numFmt w:val="bullet"/>
+      <w:lvlText w:val=""/>
+      <w:lvlJc w:val="left"/>
+      <w:pPr>
+        <w:ind w:left="6480" w:hanging="360"/>
+      </w:pPr>
+      <w:rPr>
+        <w:rFonts w:ascii="Wingdings" w:hAnsi="Wingdings" w:hint="default"/>
+      </w:rPr>
+    </w:lvl>
+  </w:abstractNum>
+  <w:abstractNum w:abstractNumId="8" w15:restartNumberingAfterBreak="0">
+    <w:nsid w:val="2FC12A18"/>
+    <w:multiLevelType w:val="hybridMultilevel"/>
+    <w:tmpl w:val="C7220EC0"/>
+    <w:lvl w:ilvl="0" w:tplc="9A0A08D8">
+      <w:numFmt w:val="bullet"/>
+      <w:lvlText w:val="•"/>
+      <w:lvlJc w:val="left"/>
+      <w:pPr>
+        <w:ind w:left="1068" w:hanging="708"/>
+      </w:pPr>
+      <w:rPr>
+        <w:rFonts w:ascii="Aptos" w:eastAsiaTheme="minorHAnsi" w:hAnsi="Aptos" w:cstheme="minorBidi" w:hint="default"/>
+      </w:rPr>
+    </w:lvl>
+    <w:lvl w:ilvl="1" w:tplc="1C3442F4">
+      <w:numFmt w:val="bullet"/>
+      <w:lvlText w:val=""/>
+      <w:lvlJc w:val="left"/>
+      <w:pPr>
+        <w:ind w:left="1788" w:hanging="708"/>
+      </w:pPr>
+      <w:rPr>
+        <w:rFonts w:ascii="Symbol" w:eastAsiaTheme="minorHAnsi" w:hAnsi="Symbol" w:cstheme="minorBidi" w:hint="default"/>
+      </w:rPr>
+    </w:lvl>
+    <w:lvl w:ilvl="2" w:tplc="04130005">
+      <w:start w:val="1"/>
+      <w:numFmt w:val="bullet"/>
+      <w:lvlText w:val=""/>
+      <w:lvlJc w:val="left"/>
+      <w:pPr>
+        <w:ind w:left="2160" w:hanging="360"/>
+      </w:pPr>
+      <w:rPr>
+        <w:rFonts w:ascii="Wingdings" w:hAnsi="Wingdings" w:hint="default"/>
+      </w:rPr>
+    </w:lvl>
+    <w:lvl w:ilvl="3" w:tplc="04130001" w:tentative="1">
+      <w:start w:val="1"/>
+      <w:numFmt w:val="bullet"/>
+      <w:lvlText w:val=""/>
+      <w:lvlJc w:val="left"/>
+      <w:pPr>
+        <w:ind w:left="2880" w:hanging="360"/>
+      </w:pPr>
+      <w:rPr>
+        <w:rFonts w:ascii="Symbol" w:hAnsi="Symbol" w:hint="default"/>
+      </w:rPr>
+    </w:lvl>
+    <w:lvl w:ilvl="4" w:tplc="04130003" w:tentative="1">
+      <w:start w:val="1"/>
+      <w:numFmt w:val="bullet"/>
+      <w:lvlText w:val="o"/>
+      <w:lvlJc w:val="left"/>
+      <w:pPr>
+        <w:ind w:left="3600" w:hanging="360"/>
+      </w:pPr>
+      <w:rPr>
+        <w:rFonts w:ascii="Courier New" w:hAnsi="Courier New" w:cs="Courier New" w:hint="default"/>
+      </w:rPr>
+    </w:lvl>
+    <w:lvl w:ilvl="5" w:tplc="04130005" w:tentative="1">
+      <w:start w:val="1"/>
+      <w:numFmt w:val="bullet"/>
+      <w:lvlText w:val=""/>
+      <w:lvlJc w:val="left"/>
+      <w:pPr>
+        <w:ind w:left="4320" w:hanging="360"/>
+      </w:pPr>
+      <w:rPr>
+        <w:rFonts w:ascii="Wingdings" w:hAnsi="Wingdings" w:hint="default"/>
+      </w:rPr>
+    </w:lvl>
+    <w:lvl w:ilvl="6" w:tplc="04130001" w:tentative="1">
+      <w:start w:val="1"/>
+      <w:numFmt w:val="bullet"/>
+      <w:lvlText w:val=""/>
+      <w:lvlJc w:val="left"/>
+      <w:pPr>
+        <w:ind w:left="5040" w:hanging="360"/>
+      </w:pPr>
+      <w:rPr>
+        <w:rFonts w:ascii="Symbol" w:hAnsi="Symbol" w:hint="default"/>
+      </w:rPr>
+    </w:lvl>
+    <w:lvl w:ilvl="7" w:tplc="04130003" w:tentative="1">
+      <w:start w:val="1"/>
+      <w:numFmt w:val="bullet"/>
+      <w:lvlText w:val="o"/>
+      <w:lvlJc w:val="left"/>
+      <w:pPr>
+        <w:ind w:left="5760" w:hanging="360"/>
+      </w:pPr>
+      <w:rPr>
+        <w:rFonts w:ascii="Courier New" w:hAnsi="Courier New" w:cs="Courier New" w:hint="default"/>
+      </w:rPr>
+    </w:lvl>
+    <w:lvl w:ilvl="8" w:tplc="04130005" w:tentative="1">
+      <w:start w:val="1"/>
+      <w:numFmt w:val="bullet"/>
+      <w:lvlText w:val=""/>
+      <w:lvlJc w:val="left"/>
+      <w:pPr>
+        <w:ind w:left="6480" w:hanging="360"/>
+      </w:pPr>
+      <w:rPr>
+        <w:rFonts w:ascii="Wingdings" w:hAnsi="Wingdings" w:hint="default"/>
+      </w:rPr>
+    </w:lvl>
+  </w:abstractNum>
+  <w:abstractNum w:abstractNumId="9" w15:restartNumberingAfterBreak="0">
     <w:nsid w:val="38A53ED9"/>
     <w:multiLevelType w:val="hybridMultilevel"/>
     <w:tmpl w:val="88267B1C"/>
@@ -1329,13 +2867,13 @@
     </w:lvl>
   </w:abstractNum>
   <w:num w:numId="1" w16cid:durableId="1276015517">
-    <w:abstractNumId w:val="1"/>
+    <w:abstractNumId w:val="4"/>
   </w:num>
   <w:num w:numId="2" w16cid:durableId="1880508304">
-    <w:abstractNumId w:val="0"/>
+    <w:abstractNumId w:val="3"/>
   </w:num>
   <w:num w:numId="3" w16cid:durableId="1623607478">
-    <w:abstractNumId w:val="2"/>
+    <w:abstractNumId w:val="6"/>
     <w:lvlOverride w:ilvl="0">
       <w:startOverride w:val="1"/>
     </w:lvlOverride>
@@ -1365,7 +2903,25 @@
     </w:lvlOverride>
   </w:num>
   <w:num w:numId="4" w16cid:durableId="590741835">
-    <w:abstractNumId w:val="3"/>
+    <w:abstractNumId w:val="9"/>
+  </w:num>
+  <w:num w:numId="5" w16cid:durableId="1025250224">
+    <w:abstractNumId w:val="1"/>
+  </w:num>
+  <w:num w:numId="6" w16cid:durableId="1710958135">
+    <w:abstractNumId w:val="8"/>
+  </w:num>
+  <w:num w:numId="7" w16cid:durableId="1881236677">
+    <w:abstractNumId w:val="7"/>
+  </w:num>
+  <w:num w:numId="8" w16cid:durableId="1609266163">
+    <w:abstractNumId w:val="0"/>
+  </w:num>
+  <w:num w:numId="9" w16cid:durableId="999388014">
+    <w:abstractNumId w:val="5"/>
+  </w:num>
+  <w:num w:numId="10" w16cid:durableId="585770666">
+    <w:abstractNumId w:val="2"/>
   </w:num>
 </w:numbering>
 </file>
@@ -1973,7 +3529,6 @@
   <w:style w:type="character" w:default="1" w:styleId="Standaardalinea-lettertype">
     <w:name w:val="Default Paragraph Font"/>
     <w:uiPriority w:val="1"/>
-    <w:semiHidden/>
     <w:unhideWhenUsed/>
   </w:style>
   <w:style w:type="table" w:default="1" w:styleId="Standaardtabel">

</xml_diff>